<commit_message>
Fix normalization, future values, prediction model
</commit_message>
<xml_diff>
--- a/FactorDescription.docx
+++ b/FactorDescription.docx
@@ -594,7 +594,7 @@
               <w:rPr>
                 <w:rFonts w:ascii="Times New Roman" w:hAnsi="Times New Roman" w:cs="Times New Roman"/>
               </w:rPr>
-              <w:t>Mean temperature in El Paso (F)</w:t>
+              <w:t>Mean annual temperature in El Paso (F)</w:t>
             </w:r>
           </w:p>
         </w:tc>
@@ -638,52 +638,28 @@
               <w:rPr>
                 <w:rFonts w:ascii="Times New Roman" w:hAnsi="Times New Roman" w:cs="Times New Roman"/>
               </w:rPr>
-              <w:t>G</w:t>
-            </w:r>
-            <w:r>
-              <w:rPr>
-                <w:rFonts w:ascii="Times New Roman" w:hAnsi="Times New Roman" w:cs="Times New Roman"/>
-              </w:rPr>
-              <w:t xml:space="preserve">ypsum </w:t>
-            </w:r>
-            <w:r>
-              <w:rPr>
-                <w:rFonts w:ascii="Times New Roman" w:hAnsi="Times New Roman" w:cs="Times New Roman"/>
-              </w:rPr>
-              <w:t xml:space="preserve">cost </w:t>
-            </w:r>
-            <w:r>
-              <w:rPr>
-                <w:rFonts w:ascii="Times New Roman" w:hAnsi="Times New Roman" w:cs="Times New Roman"/>
-              </w:rPr>
-              <w:t>(US)</w:t>
-            </w:r>
-          </w:p>
-        </w:tc>
-        <w:tc>
-          <w:tcPr>
-            <w:tcW w:w="3117" w:type="dxa"/>
-          </w:tcPr>
-          <w:p>
-            <w:pPr>
-              <w:tabs>
-                <w:tab w:val="left" w:pos="1285"/>
-              </w:tabs>
-              <w:rPr>
-                <w:rFonts w:ascii="Times New Roman" w:hAnsi="Times New Roman" w:cs="Times New Roman"/>
-              </w:rPr>
-            </w:pPr>
-            <w:r>
-              <w:rPr>
-                <w:rFonts w:ascii="Times New Roman" w:hAnsi="Times New Roman" w:cs="Times New Roman"/>
-              </w:rPr>
-              <w:t xml:space="preserve">Cost of using gypsum as a soil amendment for pecan cultivation in the US </w:t>
-            </w:r>
-            <w:r>
-              <w:rPr>
-                <w:rFonts w:ascii="Times New Roman" w:hAnsi="Times New Roman" w:cs="Times New Roman"/>
-              </w:rPr>
-              <w:t>(USD)</w:t>
+              <w:t>Gypsum cost (US)</w:t>
+            </w:r>
+          </w:p>
+        </w:tc>
+        <w:tc>
+          <w:tcPr>
+            <w:tcW w:w="3117" w:type="dxa"/>
+          </w:tcPr>
+          <w:p>
+            <w:pPr>
+              <w:tabs>
+                <w:tab w:val="left" w:pos="1285"/>
+              </w:tabs>
+              <w:rPr>
+                <w:rFonts w:ascii="Times New Roman" w:hAnsi="Times New Roman" w:cs="Times New Roman"/>
+              </w:rPr>
+            </w:pPr>
+            <w:r>
+              <w:rPr>
+                <w:rFonts w:ascii="Times New Roman" w:hAnsi="Times New Roman" w:cs="Times New Roman"/>
+              </w:rPr>
+              <w:t>Cost of gypsum in the US as a soil amendment (USD)</w:t>
             </w:r>
           </w:p>
         </w:tc>
@@ -727,82 +703,28 @@
               <w:rPr>
                 <w:rFonts w:ascii="Times New Roman" w:hAnsi="Times New Roman" w:cs="Times New Roman"/>
               </w:rPr>
-              <w:t>G</w:t>
-            </w:r>
-            <w:r>
-              <w:rPr>
-                <w:rFonts w:ascii="Times New Roman" w:hAnsi="Times New Roman" w:cs="Times New Roman"/>
-              </w:rPr>
-              <w:t>ypsum</w:t>
-            </w:r>
-            <w:r>
-              <w:rPr>
-                <w:rFonts w:ascii="Times New Roman" w:hAnsi="Times New Roman" w:cs="Times New Roman"/>
-              </w:rPr>
-              <w:t xml:space="preserve"> cost</w:t>
-            </w:r>
-            <w:r>
-              <w:rPr>
-                <w:rFonts w:ascii="Times New Roman" w:hAnsi="Times New Roman" w:cs="Times New Roman"/>
-              </w:rPr>
-              <w:t xml:space="preserve"> (</w:t>
-            </w:r>
-            <w:r>
-              <w:rPr>
-                <w:rFonts w:ascii="Times New Roman" w:hAnsi="Times New Roman" w:cs="Times New Roman"/>
-              </w:rPr>
-              <w:t>MX</w:t>
-            </w:r>
-            <w:r>
-              <w:rPr>
-                <w:rFonts w:ascii="Times New Roman" w:hAnsi="Times New Roman" w:cs="Times New Roman"/>
-              </w:rPr>
-              <w:t>)</w:t>
-            </w:r>
-          </w:p>
-        </w:tc>
-        <w:tc>
-          <w:tcPr>
-            <w:tcW w:w="3117" w:type="dxa"/>
-          </w:tcPr>
-          <w:p>
-            <w:pPr>
-              <w:tabs>
-                <w:tab w:val="left" w:pos="1285"/>
-              </w:tabs>
-              <w:rPr>
-                <w:rFonts w:ascii="Times New Roman" w:hAnsi="Times New Roman" w:cs="Times New Roman"/>
-              </w:rPr>
-            </w:pPr>
-            <w:r>
-              <w:rPr>
-                <w:rFonts w:ascii="Times New Roman" w:hAnsi="Times New Roman" w:cs="Times New Roman"/>
-              </w:rPr>
-              <w:t xml:space="preserve">Cost of using gypsum as a soil amendment for pecan cultivation in </w:t>
-            </w:r>
-            <w:r>
-              <w:rPr>
-                <w:rFonts w:ascii="Times New Roman" w:hAnsi="Times New Roman" w:cs="Times New Roman"/>
-              </w:rPr>
-              <w:t>Mexico</w:t>
-            </w:r>
-            <w:r>
-              <w:rPr>
-                <w:rFonts w:ascii="Times New Roman" w:hAnsi="Times New Roman" w:cs="Times New Roman"/>
-              </w:rPr>
-              <w:t xml:space="preserve"> </w:t>
-            </w:r>
-            <w:r>
-              <w:rPr>
-                <w:rFonts w:ascii="Times New Roman" w:hAnsi="Times New Roman" w:cs="Times New Roman"/>
-              </w:rPr>
-              <w:t>(MXN</w:t>
-            </w:r>
-            <w:r>
-              <w:rPr>
-                <w:rFonts w:ascii="Times New Roman" w:hAnsi="Times New Roman" w:cs="Times New Roman"/>
-              </w:rPr>
-              <w:t>)</w:t>
+              <w:t>Gypsum cost (MX)</w:t>
+            </w:r>
+          </w:p>
+        </w:tc>
+        <w:tc>
+          <w:tcPr>
+            <w:tcW w:w="3117" w:type="dxa"/>
+          </w:tcPr>
+          <w:p>
+            <w:pPr>
+              <w:tabs>
+                <w:tab w:val="left" w:pos="1285"/>
+              </w:tabs>
+              <w:rPr>
+                <w:rFonts w:ascii="Times New Roman" w:hAnsi="Times New Roman" w:cs="Times New Roman"/>
+              </w:rPr>
+            </w:pPr>
+            <w:r>
+              <w:rPr>
+                <w:rFonts w:ascii="Times New Roman" w:hAnsi="Times New Roman" w:cs="Times New Roman"/>
+              </w:rPr>
+              <w:t>Cost of gypsum in Mexico as a soil amendment (MXN)</w:t>
             </w:r>
           </w:p>
         </w:tc>
@@ -825,13 +747,7 @@
               <w:rPr>
                 <w:rFonts w:ascii="Times New Roman" w:hAnsi="Times New Roman" w:cs="Times New Roman"/>
               </w:rPr>
-              <w:t>Amendment Pecan Urea</w:t>
-            </w:r>
-            <w:r>
-              <w:rPr>
-                <w:rFonts w:ascii="Times New Roman" w:hAnsi="Times New Roman" w:cs="Times New Roman"/>
-              </w:rPr>
-              <w:t xml:space="preserve"> </w:t>
+              <w:t xml:space="preserve">Amendment Pecan Urea </w:t>
             </w:r>
             <w:r>
               <w:rPr>
@@ -858,76 +774,28 @@
               <w:rPr>
                 <w:rFonts w:ascii="Times New Roman" w:hAnsi="Times New Roman" w:cs="Times New Roman"/>
               </w:rPr>
-              <w:t>U</w:t>
-            </w:r>
-            <w:r>
-              <w:rPr>
-                <w:rFonts w:ascii="Times New Roman" w:hAnsi="Times New Roman" w:cs="Times New Roman"/>
-              </w:rPr>
-              <w:t>rea</w:t>
-            </w:r>
-            <w:r>
-              <w:rPr>
-                <w:rFonts w:ascii="Times New Roman" w:hAnsi="Times New Roman" w:cs="Times New Roman"/>
-              </w:rPr>
-              <w:t xml:space="preserve"> cost</w:t>
-            </w:r>
-            <w:r>
-              <w:rPr>
-                <w:rFonts w:ascii="Times New Roman" w:hAnsi="Times New Roman" w:cs="Times New Roman"/>
-              </w:rPr>
-              <w:t xml:space="preserve"> (</w:t>
-            </w:r>
-            <w:r>
-              <w:rPr>
-                <w:rFonts w:ascii="Times New Roman" w:hAnsi="Times New Roman" w:cs="Times New Roman"/>
-              </w:rPr>
-              <w:t>US</w:t>
-            </w:r>
-            <w:r>
-              <w:rPr>
-                <w:rFonts w:ascii="Times New Roman" w:hAnsi="Times New Roman" w:cs="Times New Roman"/>
-              </w:rPr>
-              <w:t>)</w:t>
-            </w:r>
-          </w:p>
-        </w:tc>
-        <w:tc>
-          <w:tcPr>
-            <w:tcW w:w="3117" w:type="dxa"/>
-          </w:tcPr>
-          <w:p>
-            <w:pPr>
-              <w:tabs>
-                <w:tab w:val="left" w:pos="1285"/>
-              </w:tabs>
-              <w:rPr>
-                <w:rFonts w:ascii="Times New Roman" w:hAnsi="Times New Roman" w:cs="Times New Roman"/>
-              </w:rPr>
-            </w:pPr>
-            <w:r>
-              <w:rPr>
-                <w:rFonts w:ascii="Times New Roman" w:hAnsi="Times New Roman" w:cs="Times New Roman"/>
-              </w:rPr>
-              <w:t xml:space="preserve">Cost of using </w:t>
-            </w:r>
-            <w:r>
-              <w:rPr>
-                <w:rFonts w:ascii="Times New Roman" w:hAnsi="Times New Roman" w:cs="Times New Roman"/>
-              </w:rPr>
-              <w:t>urea</w:t>
-            </w:r>
-            <w:r>
-              <w:rPr>
-                <w:rFonts w:ascii="Times New Roman" w:hAnsi="Times New Roman" w:cs="Times New Roman"/>
-              </w:rPr>
-              <w:t xml:space="preserve"> as a soil amendment for pecan cultivation in the US </w:t>
-            </w:r>
-            <w:r>
-              <w:rPr>
-                <w:rFonts w:ascii="Times New Roman" w:hAnsi="Times New Roman" w:cs="Times New Roman"/>
-              </w:rPr>
-              <w:t>(USD)</w:t>
+              <w:t>Urea cost (US)</w:t>
+            </w:r>
+          </w:p>
+        </w:tc>
+        <w:tc>
+          <w:tcPr>
+            <w:tcW w:w="3117" w:type="dxa"/>
+          </w:tcPr>
+          <w:p>
+            <w:pPr>
+              <w:tabs>
+                <w:tab w:val="left" w:pos="1285"/>
+              </w:tabs>
+              <w:rPr>
+                <w:rFonts w:ascii="Times New Roman" w:hAnsi="Times New Roman" w:cs="Times New Roman"/>
+              </w:rPr>
+            </w:pPr>
+            <w:r>
+              <w:rPr>
+                <w:rFonts w:ascii="Times New Roman" w:hAnsi="Times New Roman" w:cs="Times New Roman"/>
+              </w:rPr>
+              <w:t>Cost of urea in the US as a soil amendment (USD)</w:t>
             </w:r>
           </w:p>
         </w:tc>
@@ -1110,11 +978,13 @@
               </w:tabs>
               <w:rPr>
                 <w:rFonts w:ascii="Times New Roman" w:hAnsi="Times New Roman" w:cs="Times New Roman"/>
-              </w:rPr>
-            </w:pPr>
-            <w:r>
-              <w:rPr>
-                <w:rFonts w:ascii="Times New Roman" w:hAnsi="Times New Roman" w:cs="Times New Roman"/>
+                <w:highlight w:val="yellow"/>
+              </w:rPr>
+            </w:pPr>
+            <w:r>
+              <w:rPr>
+                <w:rFonts w:ascii="Times New Roman" w:hAnsi="Times New Roman" w:cs="Times New Roman"/>
+                <w:highlight w:val="yellow"/>
               </w:rPr>
               <w:t>Pecan area</w:t>
             </w:r>
@@ -1131,23 +1001,27 @@
               </w:tabs>
               <w:rPr>
                 <w:rFonts w:ascii="Times New Roman" w:hAnsi="Times New Roman" w:cs="Times New Roman"/>
-              </w:rPr>
-            </w:pPr>
-            <w:r>
-              <w:rPr>
-                <w:rFonts w:ascii="Times New Roman" w:hAnsi="Times New Roman" w:cs="Times New Roman"/>
+                <w:highlight w:val="yellow"/>
+              </w:rPr>
+            </w:pPr>
+            <w:r>
+              <w:rPr>
+                <w:rFonts w:ascii="Times New Roman" w:hAnsi="Times New Roman" w:cs="Times New Roman"/>
+                <w:highlight w:val="yellow"/>
               </w:rPr>
               <w:t>P</w:t>
             </w:r>
             <w:r>
               <w:rPr>
                 <w:rFonts w:ascii="Times New Roman" w:hAnsi="Times New Roman" w:cs="Times New Roman"/>
+                <w:highlight w:val="yellow"/>
               </w:rPr>
               <w:t>ecan</w:t>
             </w:r>
             <w:r>
               <w:rPr>
                 <w:rFonts w:ascii="Times New Roman" w:hAnsi="Times New Roman" w:cs="Times New Roman"/>
+                <w:highlight w:val="yellow"/>
               </w:rPr>
               <w:t xml:space="preserve"> area</w:t>
             </w:r>
@@ -1164,13 +1038,57 @@
               </w:tabs>
               <w:rPr>
                 <w:rFonts w:ascii="Times New Roman" w:hAnsi="Times New Roman" w:cs="Times New Roman"/>
-              </w:rPr>
-            </w:pPr>
-            <w:r>
-              <w:rPr>
-                <w:rFonts w:ascii="Times New Roman" w:hAnsi="Times New Roman" w:cs="Times New Roman"/>
-              </w:rPr>
-              <w:t>Total land area used for pecan cultivation in El Paso-Juárez (acres).</w:t>
+                <w:highlight w:val="yellow"/>
+              </w:rPr>
+            </w:pPr>
+            <w:r>
+              <w:rPr>
+                <w:rFonts w:ascii="Times New Roman" w:hAnsi="Times New Roman" w:cs="Times New Roman"/>
+                <w:highlight w:val="yellow"/>
+              </w:rPr>
+              <w:t xml:space="preserve">Total </w:t>
+            </w:r>
+            <w:r>
+              <w:rPr>
+                <w:rFonts w:ascii="Times New Roman" w:hAnsi="Times New Roman" w:cs="Times New Roman"/>
+                <w:highlight w:val="yellow"/>
+              </w:rPr>
+              <w:t>pecan area</w:t>
+            </w:r>
+            <w:r>
+              <w:rPr>
+                <w:rFonts w:ascii="Times New Roman" w:hAnsi="Times New Roman" w:cs="Times New Roman"/>
+                <w:highlight w:val="yellow"/>
+              </w:rPr>
+              <w:t xml:space="preserve"> </w:t>
+            </w:r>
+            <w:r>
+              <w:rPr>
+                <w:rFonts w:ascii="Times New Roman" w:hAnsi="Times New Roman" w:cs="Times New Roman"/>
+                <w:highlight w:val="yellow"/>
+              </w:rPr>
+              <w:t>o</w:t>
+            </w:r>
+            <w:r>
+              <w:rPr>
+                <w:rFonts w:ascii="Times New Roman" w:hAnsi="Times New Roman" w:cs="Times New Roman"/>
+                <w:highlight w:val="yellow"/>
+              </w:rPr>
+              <w:t xml:space="preserve">n </w:t>
+            </w:r>
+            <w:r>
+              <w:rPr>
+                <w:rFonts w:ascii="Times New Roman" w:hAnsi="Times New Roman" w:cs="Times New Roman"/>
+                <w:highlight w:val="yellow"/>
+              </w:rPr>
+              <w:t>the MRG basin</w:t>
+            </w:r>
+            <w:r>
+              <w:rPr>
+                <w:rFonts w:ascii="Times New Roman" w:hAnsi="Times New Roman" w:cs="Times New Roman"/>
+                <w:highlight w:val="yellow"/>
+              </w:rPr>
+              <w:t xml:space="preserve"> (acres).</w:t>
             </w:r>
           </w:p>
         </w:tc>
@@ -1187,11 +1105,13 @@
               </w:tabs>
               <w:rPr>
                 <w:rFonts w:ascii="Times New Roman" w:hAnsi="Times New Roman" w:cs="Times New Roman"/>
-              </w:rPr>
-            </w:pPr>
-            <w:r>
-              <w:rPr>
-                <w:rFonts w:ascii="Times New Roman" w:hAnsi="Times New Roman" w:cs="Times New Roman"/>
+                <w:highlight w:val="yellow"/>
+              </w:rPr>
+            </w:pPr>
+            <w:r>
+              <w:rPr>
+                <w:rFonts w:ascii="Times New Roman" w:hAnsi="Times New Roman" w:cs="Times New Roman"/>
+                <w:highlight w:val="yellow"/>
               </w:rPr>
               <w:t>Cotton area</w:t>
             </w:r>
@@ -1208,23 +1128,27 @@
               </w:tabs>
               <w:rPr>
                 <w:rFonts w:ascii="Times New Roman" w:hAnsi="Times New Roman" w:cs="Times New Roman"/>
-              </w:rPr>
-            </w:pPr>
-            <w:r>
-              <w:rPr>
-                <w:rFonts w:ascii="Times New Roman" w:hAnsi="Times New Roman" w:cs="Times New Roman"/>
+                <w:highlight w:val="yellow"/>
+              </w:rPr>
+            </w:pPr>
+            <w:r>
+              <w:rPr>
+                <w:rFonts w:ascii="Times New Roman" w:hAnsi="Times New Roman" w:cs="Times New Roman"/>
+                <w:highlight w:val="yellow"/>
               </w:rPr>
               <w:t>C</w:t>
             </w:r>
             <w:r>
               <w:rPr>
                 <w:rFonts w:ascii="Times New Roman" w:hAnsi="Times New Roman" w:cs="Times New Roman"/>
+                <w:highlight w:val="yellow"/>
               </w:rPr>
               <w:t>otton</w:t>
             </w:r>
             <w:r>
               <w:rPr>
                 <w:rFonts w:ascii="Times New Roman" w:hAnsi="Times New Roman" w:cs="Times New Roman"/>
+                <w:highlight w:val="yellow"/>
               </w:rPr>
               <w:t xml:space="preserve"> area</w:t>
             </w:r>
@@ -1241,13 +1165,43 @@
               </w:tabs>
               <w:rPr>
                 <w:rFonts w:ascii="Times New Roman" w:hAnsi="Times New Roman" w:cs="Times New Roman"/>
-              </w:rPr>
-            </w:pPr>
-            <w:r>
-              <w:rPr>
-                <w:rFonts w:ascii="Times New Roman" w:hAnsi="Times New Roman" w:cs="Times New Roman"/>
-              </w:rPr>
-              <w:t>Total land area used for cotton cultivation in El Paso-Juárez (acres).</w:t>
+                <w:highlight w:val="yellow"/>
+              </w:rPr>
+            </w:pPr>
+            <w:r>
+              <w:rPr>
+                <w:rFonts w:ascii="Times New Roman" w:hAnsi="Times New Roman" w:cs="Times New Roman"/>
+                <w:highlight w:val="yellow"/>
+              </w:rPr>
+              <w:t>Total cotton</w:t>
+            </w:r>
+            <w:r>
+              <w:rPr>
+                <w:rFonts w:ascii="Times New Roman" w:hAnsi="Times New Roman" w:cs="Times New Roman"/>
+                <w:highlight w:val="yellow"/>
+              </w:rPr>
+              <w:t xml:space="preserve"> area </w:t>
+            </w:r>
+            <w:r>
+              <w:rPr>
+                <w:rFonts w:ascii="Times New Roman" w:hAnsi="Times New Roman" w:cs="Times New Roman"/>
+                <w:highlight w:val="yellow"/>
+              </w:rPr>
+              <w:t>o</w:t>
+            </w:r>
+            <w:r>
+              <w:rPr>
+                <w:rFonts w:ascii="Times New Roman" w:hAnsi="Times New Roman" w:cs="Times New Roman"/>
+                <w:highlight w:val="yellow"/>
+              </w:rPr>
+              <w:t xml:space="preserve">n the MRG basin </w:t>
+            </w:r>
+            <w:r>
+              <w:rPr>
+                <w:rFonts w:ascii="Times New Roman" w:hAnsi="Times New Roman" w:cs="Times New Roman"/>
+                <w:highlight w:val="yellow"/>
+              </w:rPr>
+              <w:t>(acres).</w:t>
             </w:r>
           </w:p>
         </w:tc>
@@ -1264,32 +1218,43 @@
               </w:tabs>
               <w:rPr>
                 <w:rFonts w:ascii="Times New Roman" w:hAnsi="Times New Roman" w:cs="Times New Roman"/>
-              </w:rPr>
-            </w:pPr>
-            <w:r>
-              <w:rPr>
-                <w:rFonts w:ascii="Times New Roman" w:hAnsi="Times New Roman" w:cs="Times New Roman"/>
+                <w:highlight w:val="yellow"/>
+              </w:rPr>
+            </w:pPr>
+            <w:r>
+              <w:rPr>
+                <w:rFonts w:ascii="Times New Roman" w:hAnsi="Times New Roman" w:cs="Times New Roman"/>
+                <w:highlight w:val="yellow"/>
               </w:rPr>
               <w:t>Urban</w:t>
             </w:r>
-          </w:p>
-        </w:tc>
-        <w:tc>
-          <w:tcPr>
-            <w:tcW w:w="3117" w:type="dxa"/>
-          </w:tcPr>
-          <w:p>
-            <w:pPr>
-              <w:tabs>
-                <w:tab w:val="left" w:pos="1285"/>
-              </w:tabs>
-              <w:rPr>
-                <w:rFonts w:ascii="Times New Roman" w:hAnsi="Times New Roman" w:cs="Times New Roman"/>
-              </w:rPr>
-            </w:pPr>
-            <w:r>
-              <w:rPr>
-                <w:rFonts w:ascii="Times New Roman" w:hAnsi="Times New Roman" w:cs="Times New Roman"/>
+            <w:r>
+              <w:rPr>
+                <w:rFonts w:ascii="Times New Roman" w:hAnsi="Times New Roman" w:cs="Times New Roman"/>
+                <w:highlight w:val="yellow"/>
+              </w:rPr>
+              <w:t xml:space="preserve"> area</w:t>
+            </w:r>
+          </w:p>
+        </w:tc>
+        <w:tc>
+          <w:tcPr>
+            <w:tcW w:w="3117" w:type="dxa"/>
+          </w:tcPr>
+          <w:p>
+            <w:pPr>
+              <w:tabs>
+                <w:tab w:val="left" w:pos="1285"/>
+              </w:tabs>
+              <w:rPr>
+                <w:rFonts w:ascii="Times New Roman" w:hAnsi="Times New Roman" w:cs="Times New Roman"/>
+                <w:highlight w:val="yellow"/>
+              </w:rPr>
+            </w:pPr>
+            <w:r>
+              <w:rPr>
+                <w:rFonts w:ascii="Times New Roman" w:hAnsi="Times New Roman" w:cs="Times New Roman"/>
+                <w:highlight w:val="yellow"/>
               </w:rPr>
               <w:t>Urban area</w:t>
             </w:r>
@@ -1306,31 +1271,50 @@
               </w:tabs>
               <w:rPr>
                 <w:rFonts w:ascii="Times New Roman" w:hAnsi="Times New Roman" w:cs="Times New Roman"/>
-              </w:rPr>
-            </w:pPr>
-            <w:r>
-              <w:rPr>
-                <w:rFonts w:ascii="Times New Roman" w:hAnsi="Times New Roman" w:cs="Times New Roman"/>
-              </w:rPr>
-              <w:t>Total land designated as urban land</w:t>
-            </w:r>
-            <w:r>
-              <w:rPr>
-                <w:rFonts w:ascii="Times New Roman" w:hAnsi="Times New Roman" w:cs="Times New Roman"/>
+                <w:highlight w:val="yellow"/>
+              </w:rPr>
+            </w:pPr>
+            <w:r>
+              <w:rPr>
+                <w:rFonts w:ascii="Times New Roman" w:hAnsi="Times New Roman" w:cs="Times New Roman"/>
+                <w:highlight w:val="yellow"/>
+              </w:rPr>
+              <w:t xml:space="preserve">Total urban </w:t>
+            </w:r>
+            <w:r>
+              <w:rPr>
+                <w:rFonts w:ascii="Times New Roman" w:hAnsi="Times New Roman" w:cs="Times New Roman"/>
+                <w:highlight w:val="yellow"/>
+              </w:rPr>
+              <w:t>area</w:t>
+            </w:r>
+            <w:r>
+              <w:rPr>
+                <w:rFonts w:ascii="Times New Roman" w:hAnsi="Times New Roman" w:cs="Times New Roman"/>
+                <w:highlight w:val="yellow"/>
               </w:rPr>
               <w:t xml:space="preserve"> </w:t>
             </w:r>
             <w:r>
               <w:rPr>
                 <w:rFonts w:ascii="Times New Roman" w:hAnsi="Times New Roman" w:cs="Times New Roman"/>
-              </w:rPr>
-              <w:t>in El Paso-Juárez</w:t>
-            </w:r>
-            <w:r>
-              <w:rPr>
-                <w:rFonts w:ascii="Times New Roman" w:hAnsi="Times New Roman" w:cs="Times New Roman"/>
-              </w:rPr>
-              <w:t xml:space="preserve"> (acres).</w:t>
+                <w:highlight w:val="yellow"/>
+              </w:rPr>
+              <w:t>o</w:t>
+            </w:r>
+            <w:r>
+              <w:rPr>
+                <w:rFonts w:ascii="Times New Roman" w:hAnsi="Times New Roman" w:cs="Times New Roman"/>
+                <w:highlight w:val="yellow"/>
+              </w:rPr>
+              <w:t xml:space="preserve">n the MRG basin </w:t>
+            </w:r>
+            <w:r>
+              <w:rPr>
+                <w:rFonts w:ascii="Times New Roman" w:hAnsi="Times New Roman" w:cs="Times New Roman"/>
+                <w:highlight w:val="yellow"/>
+              </w:rPr>
+              <w:t>(acres).</w:t>
             </w:r>
           </w:p>
         </w:tc>
@@ -1347,32 +1331,43 @@
               </w:tabs>
               <w:rPr>
                 <w:rFonts w:ascii="Times New Roman" w:hAnsi="Times New Roman" w:cs="Times New Roman"/>
-              </w:rPr>
-            </w:pPr>
-            <w:r>
-              <w:rPr>
-                <w:rFonts w:ascii="Times New Roman" w:hAnsi="Times New Roman" w:cs="Times New Roman"/>
+                <w:highlight w:val="yellow"/>
+              </w:rPr>
+            </w:pPr>
+            <w:r>
+              <w:rPr>
+                <w:rFonts w:ascii="Times New Roman" w:hAnsi="Times New Roman" w:cs="Times New Roman"/>
+                <w:highlight w:val="yellow"/>
               </w:rPr>
               <w:t>Alfalfa</w:t>
             </w:r>
-          </w:p>
-        </w:tc>
-        <w:tc>
-          <w:tcPr>
-            <w:tcW w:w="3117" w:type="dxa"/>
-          </w:tcPr>
-          <w:p>
-            <w:pPr>
-              <w:tabs>
-                <w:tab w:val="left" w:pos="1285"/>
-              </w:tabs>
-              <w:rPr>
-                <w:rFonts w:ascii="Times New Roman" w:hAnsi="Times New Roman" w:cs="Times New Roman"/>
-              </w:rPr>
-            </w:pPr>
-            <w:r>
-              <w:rPr>
-                <w:rFonts w:ascii="Times New Roman" w:hAnsi="Times New Roman" w:cs="Times New Roman"/>
+            <w:r>
+              <w:rPr>
+                <w:rFonts w:ascii="Times New Roman" w:hAnsi="Times New Roman" w:cs="Times New Roman"/>
+                <w:highlight w:val="yellow"/>
+              </w:rPr>
+              <w:t xml:space="preserve"> area</w:t>
+            </w:r>
+          </w:p>
+        </w:tc>
+        <w:tc>
+          <w:tcPr>
+            <w:tcW w:w="3117" w:type="dxa"/>
+          </w:tcPr>
+          <w:p>
+            <w:pPr>
+              <w:tabs>
+                <w:tab w:val="left" w:pos="1285"/>
+              </w:tabs>
+              <w:rPr>
+                <w:rFonts w:ascii="Times New Roman" w:hAnsi="Times New Roman" w:cs="Times New Roman"/>
+                <w:highlight w:val="yellow"/>
+              </w:rPr>
+            </w:pPr>
+            <w:r>
+              <w:rPr>
+                <w:rFonts w:ascii="Times New Roman" w:hAnsi="Times New Roman" w:cs="Times New Roman"/>
+                <w:highlight w:val="yellow"/>
               </w:rPr>
               <w:t>Alfalfa area</w:t>
             </w:r>
@@ -1389,13 +1384,50 @@
               </w:tabs>
               <w:rPr>
                 <w:rFonts w:ascii="Times New Roman" w:hAnsi="Times New Roman" w:cs="Times New Roman"/>
-              </w:rPr>
-            </w:pPr>
-            <w:r>
-              <w:rPr>
-                <w:rFonts w:ascii="Times New Roman" w:hAnsi="Times New Roman" w:cs="Times New Roman"/>
-              </w:rPr>
-              <w:t>Total land area used for alfalfa cultivation in El Paso-Juárez (acres).</w:t>
+                <w:highlight w:val="yellow"/>
+              </w:rPr>
+            </w:pPr>
+            <w:r>
+              <w:rPr>
+                <w:rFonts w:ascii="Times New Roman" w:hAnsi="Times New Roman" w:cs="Times New Roman"/>
+                <w:highlight w:val="yellow"/>
+              </w:rPr>
+              <w:t xml:space="preserve">Total </w:t>
+            </w:r>
+            <w:r>
+              <w:rPr>
+                <w:rFonts w:ascii="Times New Roman" w:hAnsi="Times New Roman" w:cs="Times New Roman"/>
+                <w:highlight w:val="yellow"/>
+              </w:rPr>
+              <w:t xml:space="preserve">alfalfa </w:t>
+            </w:r>
+            <w:r>
+              <w:rPr>
+                <w:rFonts w:ascii="Times New Roman" w:hAnsi="Times New Roman" w:cs="Times New Roman"/>
+                <w:highlight w:val="yellow"/>
+              </w:rPr>
+              <w:t xml:space="preserve">area </w:t>
+            </w:r>
+            <w:r>
+              <w:rPr>
+                <w:rFonts w:ascii="Times New Roman" w:hAnsi="Times New Roman" w:cs="Times New Roman"/>
+                <w:highlight w:val="yellow"/>
+              </w:rPr>
+              <w:t>o</w:t>
+            </w:r>
+            <w:r>
+              <w:rPr>
+                <w:rFonts w:ascii="Times New Roman" w:hAnsi="Times New Roman" w:cs="Times New Roman"/>
+                <w:highlight w:val="yellow"/>
+              </w:rPr>
+              <w:t xml:space="preserve">n the MRG basin </w:t>
+            </w:r>
+            <w:r>
+              <w:rPr>
+                <w:rFonts w:ascii="Times New Roman" w:hAnsi="Times New Roman" w:cs="Times New Roman"/>
+                <w:highlight w:val="yellow"/>
+              </w:rPr>
+              <w:t>(acres).</w:t>
             </w:r>
           </w:p>
         </w:tc>
@@ -1412,134 +1444,117 @@
               </w:tabs>
               <w:rPr>
                 <w:rFonts w:ascii="Times New Roman" w:hAnsi="Times New Roman" w:cs="Times New Roman"/>
-              </w:rPr>
-            </w:pPr>
-            <w:r>
-              <w:rPr>
-                <w:rFonts w:ascii="Times New Roman" w:hAnsi="Times New Roman" w:cs="Times New Roman"/>
-              </w:rPr>
-              <w:t>GW availability,  well   #4904480</w:t>
-            </w:r>
-          </w:p>
-        </w:tc>
-        <w:tc>
-          <w:tcPr>
-            <w:tcW w:w="3117" w:type="dxa"/>
-          </w:tcPr>
-          <w:p>
-            <w:pPr>
-              <w:tabs>
-                <w:tab w:val="left" w:pos="1285"/>
-              </w:tabs>
-              <w:rPr>
-                <w:rFonts w:ascii="Times New Roman" w:hAnsi="Times New Roman" w:cs="Times New Roman"/>
-              </w:rPr>
-            </w:pPr>
-            <w:r>
-              <w:rPr>
-                <w:rFonts w:ascii="Times New Roman" w:hAnsi="Times New Roman" w:cs="Times New Roman"/>
-              </w:rPr>
-              <w:t>G</w:t>
-            </w:r>
-            <w:r>
-              <w:rPr>
-                <w:rFonts w:ascii="Times New Roman" w:hAnsi="Times New Roman" w:cs="Times New Roman"/>
-              </w:rPr>
-              <w:t>W</w:t>
-            </w:r>
-            <w:r>
-              <w:rPr>
-                <w:rFonts w:ascii="Times New Roman" w:hAnsi="Times New Roman" w:cs="Times New Roman"/>
+                <w:highlight w:val="yellow"/>
+              </w:rPr>
+            </w:pPr>
+            <w:r>
+              <w:rPr>
+                <w:rFonts w:ascii="Times New Roman" w:hAnsi="Times New Roman" w:cs="Times New Roman"/>
+                <w:highlight w:val="yellow"/>
+              </w:rPr>
+              <w:t>Pecan area</w:t>
+            </w:r>
+            <w:r>
+              <w:rPr>
+                <w:rFonts w:ascii="Times New Roman" w:hAnsi="Times New Roman" w:cs="Times New Roman"/>
+                <w:highlight w:val="yellow"/>
+              </w:rPr>
+              <w:t xml:space="preserve"> MX</w:t>
+            </w:r>
+          </w:p>
+        </w:tc>
+        <w:tc>
+          <w:tcPr>
+            <w:tcW w:w="3117" w:type="dxa"/>
+          </w:tcPr>
+          <w:p>
+            <w:pPr>
+              <w:tabs>
+                <w:tab w:val="left" w:pos="1285"/>
+              </w:tabs>
+              <w:rPr>
+                <w:rFonts w:ascii="Times New Roman" w:hAnsi="Times New Roman" w:cs="Times New Roman"/>
+                <w:highlight w:val="yellow"/>
+              </w:rPr>
+            </w:pPr>
+            <w:r>
+              <w:rPr>
+                <w:rFonts w:ascii="Times New Roman" w:hAnsi="Times New Roman" w:cs="Times New Roman"/>
+                <w:highlight w:val="yellow"/>
+              </w:rPr>
+              <w:t>Pecan area</w:t>
+            </w:r>
+            <w:r>
+              <w:rPr>
+                <w:rFonts w:ascii="Times New Roman" w:hAnsi="Times New Roman" w:cs="Times New Roman"/>
+                <w:highlight w:val="yellow"/>
+              </w:rPr>
+              <w:t xml:space="preserve"> MX</w:t>
+            </w:r>
+          </w:p>
+        </w:tc>
+        <w:tc>
+          <w:tcPr>
+            <w:tcW w:w="3117" w:type="dxa"/>
+          </w:tcPr>
+          <w:p>
+            <w:pPr>
+              <w:tabs>
+                <w:tab w:val="left" w:pos="1285"/>
+              </w:tabs>
+              <w:rPr>
+                <w:rFonts w:ascii="Times New Roman" w:hAnsi="Times New Roman" w:cs="Times New Roman"/>
+                <w:highlight w:val="yellow"/>
+              </w:rPr>
+            </w:pPr>
+            <w:r>
+              <w:rPr>
+                <w:rFonts w:ascii="Times New Roman" w:hAnsi="Times New Roman" w:cs="Times New Roman"/>
+                <w:highlight w:val="yellow"/>
+              </w:rPr>
+              <w:t xml:space="preserve">Total pecan </w:t>
+            </w:r>
+            <w:r>
+              <w:rPr>
+                <w:rFonts w:ascii="Times New Roman" w:hAnsi="Times New Roman" w:cs="Times New Roman"/>
+                <w:highlight w:val="yellow"/>
+              </w:rPr>
+              <w:t>area</w:t>
+            </w:r>
+            <w:r>
+              <w:rPr>
+                <w:rFonts w:ascii="Times New Roman" w:hAnsi="Times New Roman" w:cs="Times New Roman"/>
+                <w:highlight w:val="yellow"/>
               </w:rPr>
               <w:t xml:space="preserve"> </w:t>
             </w:r>
             <w:r>
               <w:rPr>
                 <w:rFonts w:ascii="Times New Roman" w:hAnsi="Times New Roman" w:cs="Times New Roman"/>
-              </w:rPr>
-              <w:t xml:space="preserve">supply </w:t>
-            </w:r>
-            <w:r>
-              <w:rPr>
-                <w:rFonts w:ascii="Times New Roman" w:hAnsi="Times New Roman" w:cs="Times New Roman"/>
-              </w:rPr>
-              <w:t>(</w:t>
-            </w:r>
-            <w:r>
-              <w:rPr>
-                <w:rFonts w:ascii="Times New Roman" w:hAnsi="Times New Roman" w:cs="Times New Roman"/>
-              </w:rPr>
-              <w:t>Mesilla</w:t>
-            </w:r>
-            <w:r>
-              <w:rPr>
-                <w:rFonts w:ascii="Times New Roman" w:hAnsi="Times New Roman" w:cs="Times New Roman"/>
-              </w:rPr>
-              <w:t>)</w:t>
-            </w:r>
-          </w:p>
-        </w:tc>
-        <w:tc>
-          <w:tcPr>
-            <w:tcW w:w="3117" w:type="dxa"/>
-          </w:tcPr>
-          <w:p>
-            <w:pPr>
-              <w:tabs>
-                <w:tab w:val="left" w:pos="1285"/>
-              </w:tabs>
-              <w:rPr>
-                <w:rFonts w:ascii="Times New Roman" w:hAnsi="Times New Roman" w:cs="Times New Roman"/>
-              </w:rPr>
-            </w:pPr>
-            <w:r>
-              <w:rPr>
-                <w:rFonts w:ascii="Times New Roman" w:hAnsi="Times New Roman" w:cs="Times New Roman"/>
-              </w:rPr>
-              <w:t>Groundwater availability of well #49</w:t>
-            </w:r>
-            <w:r>
-              <w:rPr>
-                <w:rFonts w:ascii="Times New Roman" w:hAnsi="Times New Roman" w:cs="Times New Roman"/>
-              </w:rPr>
-              <w:t>04480</w:t>
-            </w:r>
-            <w:r>
-              <w:rPr>
-                <w:rFonts w:ascii="Times New Roman" w:hAnsi="Times New Roman" w:cs="Times New Roman"/>
-              </w:rPr>
-              <w:t xml:space="preserve"> in the Hueco-Mesilla Bolson aquifer on the </w:t>
-            </w:r>
-            <w:r>
-              <w:rPr>
-                <w:rFonts w:ascii="Times New Roman" w:hAnsi="Times New Roman" w:cs="Times New Roman"/>
-              </w:rPr>
-              <w:lastRenderedPageBreak/>
-              <w:t xml:space="preserve">U.S. side </w:t>
-            </w:r>
-            <w:r>
-              <w:rPr>
-                <w:rFonts w:ascii="Times New Roman" w:hAnsi="Times New Roman" w:cs="Times New Roman"/>
-              </w:rPr>
-              <w:t>in</w:t>
-            </w:r>
-            <w:r>
-              <w:rPr>
-                <w:rFonts w:ascii="Times New Roman" w:hAnsi="Times New Roman" w:cs="Times New Roman"/>
-              </w:rPr>
-              <w:t xml:space="preserve"> El Paso (f</w:t>
-            </w:r>
-            <w:r>
-              <w:rPr>
-                <w:rFonts w:ascii="Times New Roman" w:hAnsi="Times New Roman" w:cs="Times New Roman"/>
-              </w:rPr>
-              <w:t xml:space="preserve">t </w:t>
-            </w:r>
-            <w:r>
-              <w:rPr>
-                <w:rFonts w:ascii="Times New Roman" w:hAnsi="Times New Roman" w:cs="Times New Roman"/>
-              </w:rPr>
-              <w:t>below land surface).</w:t>
+                <w:highlight w:val="yellow"/>
+              </w:rPr>
+              <w:t>o</w:t>
+            </w:r>
+            <w:r>
+              <w:rPr>
+                <w:rFonts w:ascii="Times New Roman" w:hAnsi="Times New Roman" w:cs="Times New Roman"/>
+                <w:highlight w:val="yellow"/>
+              </w:rPr>
+              <w:t>n the</w:t>
+            </w:r>
+            <w:r>
+              <w:rPr>
+                <w:rFonts w:ascii="Times New Roman" w:hAnsi="Times New Roman" w:cs="Times New Roman"/>
+                <w:highlight w:val="yellow"/>
+              </w:rPr>
+              <w:t xml:space="preserve"> MX side of the</w:t>
+            </w:r>
+            <w:r>
+              <w:rPr>
+                <w:rFonts w:ascii="Times New Roman" w:hAnsi="Times New Roman" w:cs="Times New Roman"/>
+                <w:highlight w:val="yellow"/>
+              </w:rPr>
+              <w:t xml:space="preserve"> MRG basin (acres).</w:t>
             </w:r>
           </w:p>
         </w:tc>
@@ -1556,110 +1571,103 @@
               </w:tabs>
               <w:rPr>
                 <w:rFonts w:ascii="Times New Roman" w:hAnsi="Times New Roman" w:cs="Times New Roman"/>
-              </w:rPr>
-            </w:pPr>
-            <w:r>
-              <w:rPr>
-                <w:rFonts w:ascii="Times New Roman" w:hAnsi="Times New Roman" w:cs="Times New Roman"/>
-              </w:rPr>
-              <w:lastRenderedPageBreak/>
-              <w:t>GW availability, well #4913301</w:t>
-            </w:r>
-          </w:p>
-        </w:tc>
-        <w:tc>
-          <w:tcPr>
-            <w:tcW w:w="3117" w:type="dxa"/>
-          </w:tcPr>
-          <w:p>
-            <w:pPr>
-              <w:tabs>
-                <w:tab w:val="left" w:pos="1285"/>
-              </w:tabs>
-              <w:rPr>
-                <w:rFonts w:ascii="Times New Roman" w:hAnsi="Times New Roman" w:cs="Times New Roman"/>
-              </w:rPr>
-            </w:pPr>
-            <w:r>
-              <w:rPr>
-                <w:rFonts w:ascii="Times New Roman" w:hAnsi="Times New Roman" w:cs="Times New Roman"/>
-              </w:rPr>
-              <w:t>G</w:t>
-            </w:r>
-            <w:r>
-              <w:rPr>
-                <w:rFonts w:ascii="Times New Roman" w:hAnsi="Times New Roman" w:cs="Times New Roman"/>
-              </w:rPr>
-              <w:t xml:space="preserve">W </w:t>
-            </w:r>
-            <w:r>
-              <w:rPr>
-                <w:rFonts w:ascii="Times New Roman" w:hAnsi="Times New Roman" w:cs="Times New Roman"/>
-              </w:rPr>
-              <w:t>supply</w:t>
-            </w:r>
-            <w:r>
-              <w:rPr>
-                <w:rFonts w:ascii="Times New Roman" w:hAnsi="Times New Roman" w:cs="Times New Roman"/>
-              </w:rPr>
-              <w:t xml:space="preserve"> (</w:t>
-            </w:r>
-            <w:r>
-              <w:rPr>
-                <w:rFonts w:ascii="Times New Roman" w:hAnsi="Times New Roman" w:cs="Times New Roman"/>
-              </w:rPr>
-              <w:t>Hueco</w:t>
-            </w:r>
-            <w:r>
-              <w:rPr>
-                <w:rFonts w:ascii="Times New Roman" w:hAnsi="Times New Roman" w:cs="Times New Roman"/>
-              </w:rPr>
-              <w:t>)</w:t>
-            </w:r>
-          </w:p>
-        </w:tc>
-        <w:tc>
-          <w:tcPr>
-            <w:tcW w:w="3117" w:type="dxa"/>
-          </w:tcPr>
-          <w:p>
-            <w:pPr>
-              <w:tabs>
-                <w:tab w:val="left" w:pos="1285"/>
-              </w:tabs>
-              <w:rPr>
-                <w:rFonts w:ascii="Times New Roman" w:hAnsi="Times New Roman" w:cs="Times New Roman"/>
-              </w:rPr>
-            </w:pPr>
-            <w:r>
-              <w:rPr>
-                <w:rFonts w:ascii="Times New Roman" w:hAnsi="Times New Roman" w:cs="Times New Roman"/>
-              </w:rPr>
-              <w:t xml:space="preserve">Groundwater availability of well #4913301 in the Hueco-Mesilla Bolson aquifer on the U.S. side </w:t>
-            </w:r>
-            <w:r>
-              <w:rPr>
-                <w:rFonts w:ascii="Times New Roman" w:hAnsi="Times New Roman" w:cs="Times New Roman"/>
-              </w:rPr>
-              <w:t>in</w:t>
-            </w:r>
-            <w:r>
-              <w:rPr>
-                <w:rFonts w:ascii="Times New Roman" w:hAnsi="Times New Roman" w:cs="Times New Roman"/>
-              </w:rPr>
-              <w:t xml:space="preserve"> El Paso (f</w:t>
-            </w:r>
-            <w:r>
-              <w:rPr>
-                <w:rFonts w:ascii="Times New Roman" w:hAnsi="Times New Roman" w:cs="Times New Roman"/>
-              </w:rPr>
-              <w:t xml:space="preserve">t </w:t>
-            </w:r>
-            <w:r>
-              <w:rPr>
-                <w:rFonts w:ascii="Times New Roman" w:hAnsi="Times New Roman" w:cs="Times New Roman"/>
-              </w:rPr>
-              <w:t>below land surface).</w:t>
+                <w:highlight w:val="yellow"/>
+              </w:rPr>
+            </w:pPr>
+            <w:r>
+              <w:rPr>
+                <w:rFonts w:ascii="Times New Roman" w:hAnsi="Times New Roman" w:cs="Times New Roman"/>
+                <w:highlight w:val="yellow"/>
+              </w:rPr>
+              <w:t>Cotton area</w:t>
+            </w:r>
+            <w:r>
+              <w:rPr>
+                <w:rFonts w:ascii="Times New Roman" w:hAnsi="Times New Roman" w:cs="Times New Roman"/>
+                <w:highlight w:val="yellow"/>
+              </w:rPr>
+              <w:t xml:space="preserve"> MX</w:t>
+            </w:r>
+          </w:p>
+        </w:tc>
+        <w:tc>
+          <w:tcPr>
+            <w:tcW w:w="3117" w:type="dxa"/>
+          </w:tcPr>
+          <w:p>
+            <w:pPr>
+              <w:tabs>
+                <w:tab w:val="left" w:pos="1285"/>
+              </w:tabs>
+              <w:rPr>
+                <w:rFonts w:ascii="Times New Roman" w:hAnsi="Times New Roman" w:cs="Times New Roman"/>
+                <w:highlight w:val="yellow"/>
+              </w:rPr>
+            </w:pPr>
+            <w:r>
+              <w:rPr>
+                <w:rFonts w:ascii="Times New Roman" w:hAnsi="Times New Roman" w:cs="Times New Roman"/>
+                <w:highlight w:val="yellow"/>
+              </w:rPr>
+              <w:t>Cotton area</w:t>
+            </w:r>
+            <w:r>
+              <w:rPr>
+                <w:rFonts w:ascii="Times New Roman" w:hAnsi="Times New Roman" w:cs="Times New Roman"/>
+                <w:highlight w:val="yellow"/>
+              </w:rPr>
+              <w:t xml:space="preserve"> MX</w:t>
+            </w:r>
+          </w:p>
+        </w:tc>
+        <w:tc>
+          <w:tcPr>
+            <w:tcW w:w="3117" w:type="dxa"/>
+          </w:tcPr>
+          <w:p>
+            <w:pPr>
+              <w:tabs>
+                <w:tab w:val="left" w:pos="1285"/>
+              </w:tabs>
+              <w:rPr>
+                <w:rFonts w:ascii="Times New Roman" w:hAnsi="Times New Roman" w:cs="Times New Roman"/>
+                <w:highlight w:val="yellow"/>
+              </w:rPr>
+            </w:pPr>
+            <w:r>
+              <w:rPr>
+                <w:rFonts w:ascii="Times New Roman" w:hAnsi="Times New Roman" w:cs="Times New Roman"/>
+                <w:highlight w:val="yellow"/>
+              </w:rPr>
+              <w:t xml:space="preserve">Total </w:t>
+            </w:r>
+            <w:r>
+              <w:rPr>
+                <w:rFonts w:ascii="Times New Roman" w:hAnsi="Times New Roman" w:cs="Times New Roman"/>
+                <w:highlight w:val="yellow"/>
+              </w:rPr>
+              <w:t>cotton</w:t>
+            </w:r>
+            <w:r>
+              <w:rPr>
+                <w:rFonts w:ascii="Times New Roman" w:hAnsi="Times New Roman" w:cs="Times New Roman"/>
+                <w:highlight w:val="yellow"/>
+              </w:rPr>
+              <w:t xml:space="preserve"> area </w:t>
+            </w:r>
+            <w:r>
+              <w:rPr>
+                <w:rFonts w:ascii="Times New Roman" w:hAnsi="Times New Roman" w:cs="Times New Roman"/>
+                <w:highlight w:val="yellow"/>
+              </w:rPr>
+              <w:t>o</w:t>
+            </w:r>
+            <w:r>
+              <w:rPr>
+                <w:rFonts w:ascii="Times New Roman" w:hAnsi="Times New Roman" w:cs="Times New Roman"/>
+                <w:highlight w:val="yellow"/>
+              </w:rPr>
+              <w:t>n the MX side of the MRG basin (acres).</w:t>
             </w:r>
           </w:p>
         </w:tc>
@@ -1676,97 +1684,103 @@
               </w:tabs>
               <w:rPr>
                 <w:rFonts w:ascii="Times New Roman" w:hAnsi="Times New Roman" w:cs="Times New Roman"/>
-              </w:rPr>
-            </w:pPr>
-            <w:r>
-              <w:rPr>
-                <w:rFonts w:ascii="Times New Roman" w:hAnsi="Times New Roman" w:cs="Times New Roman"/>
-              </w:rPr>
-              <w:t>GW quality, TDS, well #4914417</w:t>
-            </w:r>
-          </w:p>
-        </w:tc>
-        <w:tc>
-          <w:tcPr>
-            <w:tcW w:w="3117" w:type="dxa"/>
-          </w:tcPr>
-          <w:p>
-            <w:pPr>
-              <w:tabs>
-                <w:tab w:val="left" w:pos="1285"/>
-              </w:tabs>
-              <w:rPr>
-                <w:rFonts w:ascii="Times New Roman" w:hAnsi="Times New Roman" w:cs="Times New Roman"/>
-              </w:rPr>
-            </w:pPr>
-            <w:r>
-              <w:rPr>
-                <w:rFonts w:ascii="Times New Roman" w:hAnsi="Times New Roman" w:cs="Times New Roman"/>
-              </w:rPr>
-              <w:t>GW</w:t>
-            </w:r>
-            <w:r>
-              <w:rPr>
-                <w:rFonts w:ascii="Times New Roman" w:hAnsi="Times New Roman" w:cs="Times New Roman"/>
-              </w:rPr>
-              <w:t xml:space="preserve"> quality (</w:t>
-            </w:r>
-            <w:r>
-              <w:rPr>
-                <w:rFonts w:ascii="Times New Roman" w:hAnsi="Times New Roman" w:cs="Times New Roman"/>
-              </w:rPr>
-              <w:t>Hueco</w:t>
-            </w:r>
-            <w:r>
-              <w:rPr>
-                <w:rFonts w:ascii="Times New Roman" w:hAnsi="Times New Roman" w:cs="Times New Roman"/>
-              </w:rPr>
-              <w:t>)</w:t>
-            </w:r>
-          </w:p>
-        </w:tc>
-        <w:tc>
-          <w:tcPr>
-            <w:tcW w:w="3117" w:type="dxa"/>
-          </w:tcPr>
-          <w:p>
-            <w:pPr>
-              <w:tabs>
-                <w:tab w:val="left" w:pos="1285"/>
-              </w:tabs>
-              <w:rPr>
-                <w:rFonts w:ascii="Times New Roman" w:hAnsi="Times New Roman" w:cs="Times New Roman"/>
-              </w:rPr>
-            </w:pPr>
-            <w:r>
-              <w:rPr>
-                <w:rFonts w:ascii="Times New Roman" w:hAnsi="Times New Roman" w:cs="Times New Roman"/>
-              </w:rPr>
-              <w:t>Groundwater quality in terms of Total Dissolved Solids (TDS) for well #491</w:t>
-            </w:r>
-            <w:r>
-              <w:rPr>
-                <w:rFonts w:ascii="Times New Roman" w:hAnsi="Times New Roman" w:cs="Times New Roman"/>
-              </w:rPr>
-              <w:t>4417</w:t>
-            </w:r>
-            <w:r>
-              <w:rPr>
-                <w:rFonts w:ascii="Times New Roman" w:hAnsi="Times New Roman" w:cs="Times New Roman"/>
-              </w:rPr>
-              <w:t xml:space="preserve"> in the Hueco-Mesilla Bolson aquifer on the U.S. side </w:t>
-            </w:r>
-            <w:r>
-              <w:rPr>
-                <w:rFonts w:ascii="Times New Roman" w:hAnsi="Times New Roman" w:cs="Times New Roman"/>
-              </w:rPr>
-              <w:t>in</w:t>
-            </w:r>
-            <w:r>
-              <w:rPr>
-                <w:rFonts w:ascii="Times New Roman" w:hAnsi="Times New Roman" w:cs="Times New Roman"/>
-              </w:rPr>
-              <w:t xml:space="preserve"> El Paso (mg/L).</w:t>
+                <w:highlight w:val="yellow"/>
+              </w:rPr>
+            </w:pPr>
+            <w:r>
+              <w:rPr>
+                <w:rFonts w:ascii="Times New Roman" w:hAnsi="Times New Roman" w:cs="Times New Roman"/>
+                <w:highlight w:val="yellow"/>
+              </w:rPr>
+              <w:t>Urban area</w:t>
+            </w:r>
+            <w:r>
+              <w:rPr>
+                <w:rFonts w:ascii="Times New Roman" w:hAnsi="Times New Roman" w:cs="Times New Roman"/>
+                <w:highlight w:val="yellow"/>
+              </w:rPr>
+              <w:t xml:space="preserve"> MX</w:t>
+            </w:r>
+          </w:p>
+        </w:tc>
+        <w:tc>
+          <w:tcPr>
+            <w:tcW w:w="3117" w:type="dxa"/>
+          </w:tcPr>
+          <w:p>
+            <w:pPr>
+              <w:tabs>
+                <w:tab w:val="left" w:pos="1285"/>
+              </w:tabs>
+              <w:rPr>
+                <w:rFonts w:ascii="Times New Roman" w:hAnsi="Times New Roman" w:cs="Times New Roman"/>
+                <w:highlight w:val="yellow"/>
+              </w:rPr>
+            </w:pPr>
+            <w:r>
+              <w:rPr>
+                <w:rFonts w:ascii="Times New Roman" w:hAnsi="Times New Roman" w:cs="Times New Roman"/>
+                <w:highlight w:val="yellow"/>
+              </w:rPr>
+              <w:t>Urban area</w:t>
+            </w:r>
+            <w:r>
+              <w:rPr>
+                <w:rFonts w:ascii="Times New Roman" w:hAnsi="Times New Roman" w:cs="Times New Roman"/>
+                <w:highlight w:val="yellow"/>
+              </w:rPr>
+              <w:t xml:space="preserve"> MX</w:t>
+            </w:r>
+          </w:p>
+        </w:tc>
+        <w:tc>
+          <w:tcPr>
+            <w:tcW w:w="3117" w:type="dxa"/>
+          </w:tcPr>
+          <w:p>
+            <w:pPr>
+              <w:tabs>
+                <w:tab w:val="left" w:pos="1285"/>
+              </w:tabs>
+              <w:rPr>
+                <w:rFonts w:ascii="Times New Roman" w:hAnsi="Times New Roman" w:cs="Times New Roman"/>
+                <w:highlight w:val="yellow"/>
+              </w:rPr>
+            </w:pPr>
+            <w:r>
+              <w:rPr>
+                <w:rFonts w:ascii="Times New Roman" w:hAnsi="Times New Roman" w:cs="Times New Roman"/>
+                <w:highlight w:val="yellow"/>
+              </w:rPr>
+              <w:t xml:space="preserve">Total </w:t>
+            </w:r>
+            <w:r>
+              <w:rPr>
+                <w:rFonts w:ascii="Times New Roman" w:hAnsi="Times New Roman" w:cs="Times New Roman"/>
+                <w:highlight w:val="yellow"/>
+              </w:rPr>
+              <w:t>urban</w:t>
+            </w:r>
+            <w:r>
+              <w:rPr>
+                <w:rFonts w:ascii="Times New Roman" w:hAnsi="Times New Roman" w:cs="Times New Roman"/>
+                <w:highlight w:val="yellow"/>
+              </w:rPr>
+              <w:t xml:space="preserve"> area </w:t>
+            </w:r>
+            <w:r>
+              <w:rPr>
+                <w:rFonts w:ascii="Times New Roman" w:hAnsi="Times New Roman" w:cs="Times New Roman"/>
+                <w:highlight w:val="yellow"/>
+              </w:rPr>
+              <w:t>o</w:t>
+            </w:r>
+            <w:r>
+              <w:rPr>
+                <w:rFonts w:ascii="Times New Roman" w:hAnsi="Times New Roman" w:cs="Times New Roman"/>
+                <w:highlight w:val="yellow"/>
+              </w:rPr>
+              <w:t>n the MX side of the MRG basin (acres).</w:t>
             </w:r>
           </w:p>
         </w:tc>
@@ -1783,115 +1797,104 @@
               </w:tabs>
               <w:rPr>
                 <w:rFonts w:ascii="Times New Roman" w:hAnsi="Times New Roman" w:cs="Times New Roman"/>
-              </w:rPr>
-            </w:pPr>
-            <w:r>
-              <w:rPr>
-                <w:rFonts w:ascii="Times New Roman" w:hAnsi="Times New Roman" w:cs="Times New Roman"/>
-              </w:rPr>
-              <w:t>SW availability, El Paso</w:t>
-            </w:r>
-          </w:p>
-        </w:tc>
-        <w:tc>
-          <w:tcPr>
-            <w:tcW w:w="3117" w:type="dxa"/>
-          </w:tcPr>
-          <w:p>
-            <w:pPr>
-              <w:tabs>
-                <w:tab w:val="left" w:pos="1285"/>
-              </w:tabs>
-              <w:rPr>
-                <w:rFonts w:ascii="Times New Roman" w:hAnsi="Times New Roman" w:cs="Times New Roman"/>
-              </w:rPr>
-            </w:pPr>
-            <w:r>
-              <w:rPr>
-                <w:rFonts w:ascii="Times New Roman" w:hAnsi="Times New Roman" w:cs="Times New Roman"/>
-              </w:rPr>
-              <w:t>S</w:t>
-            </w:r>
-            <w:r>
-              <w:rPr>
-                <w:rFonts w:ascii="Times New Roman" w:hAnsi="Times New Roman" w:cs="Times New Roman"/>
-              </w:rPr>
-              <w:t xml:space="preserve">W </w:t>
-            </w:r>
-            <w:r>
-              <w:rPr>
-                <w:rFonts w:ascii="Times New Roman" w:hAnsi="Times New Roman" w:cs="Times New Roman"/>
-              </w:rPr>
-              <w:t>supply</w:t>
-            </w:r>
-            <w:r>
-              <w:rPr>
-                <w:rFonts w:ascii="Times New Roman" w:hAnsi="Times New Roman" w:cs="Times New Roman"/>
-              </w:rPr>
-              <w:t xml:space="preserve"> (</w:t>
-            </w:r>
-            <w:r>
-              <w:rPr>
-                <w:rFonts w:ascii="Times New Roman" w:hAnsi="Times New Roman" w:cs="Times New Roman"/>
-              </w:rPr>
-              <w:t>EPNo.1</w:t>
-            </w:r>
-            <w:r>
-              <w:rPr>
-                <w:rFonts w:ascii="Times New Roman" w:hAnsi="Times New Roman" w:cs="Times New Roman"/>
-              </w:rPr>
-              <w:t>)</w:t>
-            </w:r>
-          </w:p>
-        </w:tc>
-        <w:tc>
-          <w:tcPr>
-            <w:tcW w:w="3117" w:type="dxa"/>
-          </w:tcPr>
-          <w:p>
-            <w:pPr>
-              <w:tabs>
-                <w:tab w:val="left" w:pos="1285"/>
-              </w:tabs>
-              <w:rPr>
-                <w:rFonts w:ascii="Times New Roman" w:hAnsi="Times New Roman" w:cs="Times New Roman"/>
-              </w:rPr>
-            </w:pPr>
-            <w:r>
-              <w:rPr>
-                <w:rFonts w:ascii="Times New Roman" w:hAnsi="Times New Roman" w:cs="Times New Roman"/>
-              </w:rPr>
-              <w:t>Surface water availability granted to</w:t>
-            </w:r>
-            <w:r>
-              <w:rPr>
-                <w:rFonts w:ascii="Times New Roman" w:hAnsi="Times New Roman" w:cs="Times New Roman"/>
-              </w:rPr>
-              <w:t xml:space="preserve"> El Paso</w:t>
-            </w:r>
-            <w:r>
-              <w:rPr>
-                <w:rFonts w:ascii="Times New Roman" w:hAnsi="Times New Roman" w:cs="Times New Roman"/>
-              </w:rPr>
-              <w:t xml:space="preserve"> County Water Improvement District number 1</w:t>
-            </w:r>
-            <w:r>
-              <w:rPr>
-                <w:rFonts w:ascii="Times New Roman" w:hAnsi="Times New Roman" w:cs="Times New Roman"/>
-              </w:rPr>
-              <w:t xml:space="preserve"> </w:t>
-            </w:r>
-            <w:r>
-              <w:rPr>
-                <w:rFonts w:ascii="Times New Roman" w:hAnsi="Times New Roman" w:cs="Times New Roman"/>
-              </w:rPr>
-              <w:t xml:space="preserve">according to the </w:t>
-            </w:r>
-            <w:r>
-              <w:rPr>
-                <w:rFonts w:ascii="Times New Roman" w:hAnsi="Times New Roman" w:cs="Times New Roman"/>
-              </w:rPr>
-              <w:t>Rio Grande Compact (acre-ft)</w:t>
+                <w:highlight w:val="yellow"/>
+              </w:rPr>
+            </w:pPr>
+            <w:r>
+              <w:rPr>
+                <w:rFonts w:ascii="Times New Roman" w:hAnsi="Times New Roman" w:cs="Times New Roman"/>
+                <w:highlight w:val="yellow"/>
+              </w:rPr>
+              <w:lastRenderedPageBreak/>
+              <w:t>Alfalfa area</w:t>
+            </w:r>
+            <w:r>
+              <w:rPr>
+                <w:rFonts w:ascii="Times New Roman" w:hAnsi="Times New Roman" w:cs="Times New Roman"/>
+                <w:highlight w:val="yellow"/>
+              </w:rPr>
+              <w:t xml:space="preserve"> MX</w:t>
+            </w:r>
+          </w:p>
+        </w:tc>
+        <w:tc>
+          <w:tcPr>
+            <w:tcW w:w="3117" w:type="dxa"/>
+          </w:tcPr>
+          <w:p>
+            <w:pPr>
+              <w:tabs>
+                <w:tab w:val="left" w:pos="1285"/>
+              </w:tabs>
+              <w:rPr>
+                <w:rFonts w:ascii="Times New Roman" w:hAnsi="Times New Roman" w:cs="Times New Roman"/>
+                <w:highlight w:val="yellow"/>
+              </w:rPr>
+            </w:pPr>
+            <w:r>
+              <w:rPr>
+                <w:rFonts w:ascii="Times New Roman" w:hAnsi="Times New Roman" w:cs="Times New Roman"/>
+                <w:highlight w:val="yellow"/>
+              </w:rPr>
+              <w:t>Alfalfa area</w:t>
+            </w:r>
+            <w:r>
+              <w:rPr>
+                <w:rFonts w:ascii="Times New Roman" w:hAnsi="Times New Roman" w:cs="Times New Roman"/>
+                <w:highlight w:val="yellow"/>
+              </w:rPr>
+              <w:t xml:space="preserve"> MX</w:t>
+            </w:r>
+          </w:p>
+        </w:tc>
+        <w:tc>
+          <w:tcPr>
+            <w:tcW w:w="3117" w:type="dxa"/>
+          </w:tcPr>
+          <w:p>
+            <w:pPr>
+              <w:tabs>
+                <w:tab w:val="left" w:pos="1285"/>
+              </w:tabs>
+              <w:rPr>
+                <w:rFonts w:ascii="Times New Roman" w:hAnsi="Times New Roman" w:cs="Times New Roman"/>
+                <w:highlight w:val="yellow"/>
+              </w:rPr>
+            </w:pPr>
+            <w:r>
+              <w:rPr>
+                <w:rFonts w:ascii="Times New Roman" w:hAnsi="Times New Roman" w:cs="Times New Roman"/>
+                <w:highlight w:val="yellow"/>
+              </w:rPr>
+              <w:t xml:space="preserve">Total </w:t>
+            </w:r>
+            <w:r>
+              <w:rPr>
+                <w:rFonts w:ascii="Times New Roman" w:hAnsi="Times New Roman" w:cs="Times New Roman"/>
+                <w:highlight w:val="yellow"/>
+              </w:rPr>
+              <w:t>alfalfa</w:t>
+            </w:r>
+            <w:r>
+              <w:rPr>
+                <w:rFonts w:ascii="Times New Roman" w:hAnsi="Times New Roman" w:cs="Times New Roman"/>
+                <w:highlight w:val="yellow"/>
+              </w:rPr>
+              <w:t xml:space="preserve"> area </w:t>
+            </w:r>
+            <w:r>
+              <w:rPr>
+                <w:rFonts w:ascii="Times New Roman" w:hAnsi="Times New Roman" w:cs="Times New Roman"/>
+                <w:highlight w:val="yellow"/>
+              </w:rPr>
+              <w:t>o</w:t>
+            </w:r>
+            <w:r>
+              <w:rPr>
+                <w:rFonts w:ascii="Times New Roman" w:hAnsi="Times New Roman" w:cs="Times New Roman"/>
+                <w:highlight w:val="yellow"/>
+              </w:rPr>
+              <w:t>n the MX side of the MRG basin (acres).</w:t>
             </w:r>
           </w:p>
         </w:tc>
@@ -1908,97 +1911,103 @@
               </w:tabs>
               <w:rPr>
                 <w:rFonts w:ascii="Times New Roman" w:hAnsi="Times New Roman" w:cs="Times New Roman"/>
-              </w:rPr>
-            </w:pPr>
-            <w:r>
-              <w:rPr>
-                <w:rFonts w:ascii="Times New Roman" w:hAnsi="Times New Roman" w:cs="Times New Roman"/>
-              </w:rPr>
-              <w:t>SW availability, Elephant Butte</w:t>
-            </w:r>
-          </w:p>
-        </w:tc>
-        <w:tc>
-          <w:tcPr>
-            <w:tcW w:w="3117" w:type="dxa"/>
-          </w:tcPr>
-          <w:p>
-            <w:pPr>
-              <w:tabs>
-                <w:tab w:val="left" w:pos="1285"/>
-              </w:tabs>
-              <w:rPr>
-                <w:rFonts w:ascii="Times New Roman" w:hAnsi="Times New Roman" w:cs="Times New Roman"/>
-              </w:rPr>
-            </w:pPr>
-            <w:r>
-              <w:rPr>
-                <w:rFonts w:ascii="Times New Roman" w:hAnsi="Times New Roman" w:cs="Times New Roman"/>
-              </w:rPr>
-              <w:t>S</w:t>
-            </w:r>
-            <w:r>
-              <w:rPr>
-                <w:rFonts w:ascii="Times New Roman" w:hAnsi="Times New Roman" w:cs="Times New Roman"/>
-              </w:rPr>
-              <w:t xml:space="preserve">W </w:t>
-            </w:r>
-            <w:r>
-              <w:rPr>
-                <w:rFonts w:ascii="Times New Roman" w:hAnsi="Times New Roman" w:cs="Times New Roman"/>
-              </w:rPr>
-              <w:t>supply</w:t>
-            </w:r>
-            <w:r>
-              <w:rPr>
-                <w:rFonts w:ascii="Times New Roman" w:hAnsi="Times New Roman" w:cs="Times New Roman"/>
-              </w:rPr>
-              <w:t xml:space="preserve"> (</w:t>
-            </w:r>
-            <w:r>
-              <w:rPr>
-                <w:rFonts w:ascii="Times New Roman" w:hAnsi="Times New Roman" w:cs="Times New Roman"/>
-              </w:rPr>
-              <w:t>EBID</w:t>
-            </w:r>
-            <w:r>
-              <w:rPr>
-                <w:rFonts w:ascii="Times New Roman" w:hAnsi="Times New Roman" w:cs="Times New Roman"/>
-              </w:rPr>
-              <w:t>)</w:t>
-            </w:r>
-          </w:p>
-        </w:tc>
-        <w:tc>
-          <w:tcPr>
-            <w:tcW w:w="3117" w:type="dxa"/>
-          </w:tcPr>
-          <w:p>
-            <w:pPr>
-              <w:tabs>
-                <w:tab w:val="left" w:pos="1285"/>
-              </w:tabs>
-              <w:rPr>
-                <w:rFonts w:ascii="Times New Roman" w:hAnsi="Times New Roman" w:cs="Times New Roman"/>
-              </w:rPr>
-            </w:pPr>
-            <w:r>
-              <w:rPr>
-                <w:rFonts w:ascii="Times New Roman" w:hAnsi="Times New Roman" w:cs="Times New Roman"/>
-              </w:rPr>
-              <w:t>Surface water availability granted to</w:t>
-            </w:r>
-            <w:r>
-              <w:rPr>
-                <w:rFonts w:ascii="Times New Roman" w:hAnsi="Times New Roman" w:cs="Times New Roman"/>
-              </w:rPr>
-              <w:t xml:space="preserve"> Elephant Butte Irrigation District</w:t>
-            </w:r>
-            <w:r>
-              <w:rPr>
-                <w:rFonts w:ascii="Times New Roman" w:hAnsi="Times New Roman" w:cs="Times New Roman"/>
-              </w:rPr>
-              <w:t xml:space="preserve"> according to the Rio Grande Compact (acre-ft)</w:t>
+                <w:highlight w:val="yellow"/>
+              </w:rPr>
+            </w:pPr>
+            <w:r>
+              <w:rPr>
+                <w:rFonts w:ascii="Times New Roman" w:hAnsi="Times New Roman" w:cs="Times New Roman"/>
+                <w:highlight w:val="yellow"/>
+              </w:rPr>
+              <w:t>Pecan area</w:t>
+            </w:r>
+            <w:r>
+              <w:rPr>
+                <w:rFonts w:ascii="Times New Roman" w:hAnsi="Times New Roman" w:cs="Times New Roman"/>
+                <w:highlight w:val="yellow"/>
+              </w:rPr>
+              <w:t xml:space="preserve"> US</w:t>
+            </w:r>
+          </w:p>
+        </w:tc>
+        <w:tc>
+          <w:tcPr>
+            <w:tcW w:w="3117" w:type="dxa"/>
+          </w:tcPr>
+          <w:p>
+            <w:pPr>
+              <w:tabs>
+                <w:tab w:val="left" w:pos="1285"/>
+              </w:tabs>
+              <w:rPr>
+                <w:rFonts w:ascii="Times New Roman" w:hAnsi="Times New Roman" w:cs="Times New Roman"/>
+                <w:highlight w:val="yellow"/>
+              </w:rPr>
+            </w:pPr>
+            <w:r>
+              <w:rPr>
+                <w:rFonts w:ascii="Times New Roman" w:hAnsi="Times New Roman" w:cs="Times New Roman"/>
+                <w:highlight w:val="yellow"/>
+              </w:rPr>
+              <w:t>Pecan area</w:t>
+            </w:r>
+            <w:r>
+              <w:rPr>
+                <w:rFonts w:ascii="Times New Roman" w:hAnsi="Times New Roman" w:cs="Times New Roman"/>
+                <w:highlight w:val="yellow"/>
+              </w:rPr>
+              <w:t xml:space="preserve"> US</w:t>
+            </w:r>
+          </w:p>
+        </w:tc>
+        <w:tc>
+          <w:tcPr>
+            <w:tcW w:w="3117" w:type="dxa"/>
+          </w:tcPr>
+          <w:p>
+            <w:pPr>
+              <w:tabs>
+                <w:tab w:val="left" w:pos="1285"/>
+              </w:tabs>
+              <w:rPr>
+                <w:rFonts w:ascii="Times New Roman" w:hAnsi="Times New Roman" w:cs="Times New Roman"/>
+                <w:highlight w:val="yellow"/>
+              </w:rPr>
+            </w:pPr>
+            <w:r>
+              <w:rPr>
+                <w:rFonts w:ascii="Times New Roman" w:hAnsi="Times New Roman" w:cs="Times New Roman"/>
+                <w:highlight w:val="yellow"/>
+              </w:rPr>
+              <w:t xml:space="preserve">Total pecan area </w:t>
+            </w:r>
+            <w:r>
+              <w:rPr>
+                <w:rFonts w:ascii="Times New Roman" w:hAnsi="Times New Roman" w:cs="Times New Roman"/>
+                <w:highlight w:val="yellow"/>
+              </w:rPr>
+              <w:t>o</w:t>
+            </w:r>
+            <w:r>
+              <w:rPr>
+                <w:rFonts w:ascii="Times New Roman" w:hAnsi="Times New Roman" w:cs="Times New Roman"/>
+                <w:highlight w:val="yellow"/>
+              </w:rPr>
+              <w:t>n the</w:t>
+            </w:r>
+            <w:r>
+              <w:rPr>
+                <w:rFonts w:ascii="Times New Roman" w:hAnsi="Times New Roman" w:cs="Times New Roman"/>
+                <w:highlight w:val="yellow"/>
+              </w:rPr>
+              <w:t xml:space="preserve"> US</w:t>
+            </w:r>
+            <w:r>
+              <w:rPr>
+                <w:rFonts w:ascii="Times New Roman" w:hAnsi="Times New Roman" w:cs="Times New Roman"/>
+                <w:highlight w:val="yellow"/>
+              </w:rPr>
+              <w:t xml:space="preserve"> side of the MRG basin (acres).</w:t>
             </w:r>
           </w:p>
         </w:tc>
@@ -2015,97 +2024,103 @@
               </w:tabs>
               <w:rPr>
                 <w:rFonts w:ascii="Times New Roman" w:hAnsi="Times New Roman" w:cs="Times New Roman"/>
-              </w:rPr>
-            </w:pPr>
-            <w:r>
-              <w:rPr>
-                <w:rFonts w:ascii="Times New Roman" w:hAnsi="Times New Roman" w:cs="Times New Roman"/>
-              </w:rPr>
-              <w:t>SW availability, Juarez</w:t>
-            </w:r>
-          </w:p>
-        </w:tc>
-        <w:tc>
-          <w:tcPr>
-            <w:tcW w:w="3117" w:type="dxa"/>
-          </w:tcPr>
-          <w:p>
-            <w:pPr>
-              <w:tabs>
-                <w:tab w:val="left" w:pos="1285"/>
-              </w:tabs>
-              <w:rPr>
-                <w:rFonts w:ascii="Times New Roman" w:hAnsi="Times New Roman" w:cs="Times New Roman"/>
-              </w:rPr>
-            </w:pPr>
-            <w:r>
-              <w:rPr>
-                <w:rFonts w:ascii="Times New Roman" w:hAnsi="Times New Roman" w:cs="Times New Roman"/>
-              </w:rPr>
-              <w:t>S</w:t>
-            </w:r>
-            <w:r>
-              <w:rPr>
-                <w:rFonts w:ascii="Times New Roman" w:hAnsi="Times New Roman" w:cs="Times New Roman"/>
-              </w:rPr>
-              <w:t xml:space="preserve">W </w:t>
-            </w:r>
-            <w:r>
-              <w:rPr>
-                <w:rFonts w:ascii="Times New Roman" w:hAnsi="Times New Roman" w:cs="Times New Roman"/>
-              </w:rPr>
-              <w:t xml:space="preserve">supply </w:t>
-            </w:r>
-            <w:r>
-              <w:rPr>
-                <w:rFonts w:ascii="Times New Roman" w:hAnsi="Times New Roman" w:cs="Times New Roman"/>
-              </w:rPr>
-              <w:t>(</w:t>
-            </w:r>
-            <w:r>
-              <w:rPr>
-                <w:rFonts w:ascii="Times New Roman" w:hAnsi="Times New Roman" w:cs="Times New Roman"/>
-              </w:rPr>
-              <w:t>Juarez</w:t>
-            </w:r>
-            <w:r>
-              <w:rPr>
-                <w:rFonts w:ascii="Times New Roman" w:hAnsi="Times New Roman" w:cs="Times New Roman"/>
-              </w:rPr>
-              <w:t>)</w:t>
-            </w:r>
-          </w:p>
-        </w:tc>
-        <w:tc>
-          <w:tcPr>
-            <w:tcW w:w="3117" w:type="dxa"/>
-          </w:tcPr>
-          <w:p>
-            <w:pPr>
-              <w:tabs>
-                <w:tab w:val="left" w:pos="1285"/>
-              </w:tabs>
-              <w:rPr>
-                <w:rFonts w:ascii="Times New Roman" w:hAnsi="Times New Roman" w:cs="Times New Roman"/>
-              </w:rPr>
-            </w:pPr>
-            <w:r>
-              <w:rPr>
-                <w:rFonts w:ascii="Times New Roman" w:hAnsi="Times New Roman" w:cs="Times New Roman"/>
-              </w:rPr>
-              <w:t>Surface water availability granted to</w:t>
-            </w:r>
-            <w:r>
-              <w:rPr>
-                <w:rFonts w:ascii="Times New Roman" w:hAnsi="Times New Roman" w:cs="Times New Roman"/>
-              </w:rPr>
-              <w:t xml:space="preserve"> the Irrigation District 009 in Ciudad Juarez, Mexico,</w:t>
-            </w:r>
-            <w:r>
-              <w:rPr>
-                <w:rFonts w:ascii="Times New Roman" w:hAnsi="Times New Roman" w:cs="Times New Roman"/>
-              </w:rPr>
-              <w:t xml:space="preserve"> according to the Rio Grande Compact (acre-ft)</w:t>
+                <w:highlight w:val="yellow"/>
+              </w:rPr>
+            </w:pPr>
+            <w:r>
+              <w:rPr>
+                <w:rFonts w:ascii="Times New Roman" w:hAnsi="Times New Roman" w:cs="Times New Roman"/>
+                <w:highlight w:val="yellow"/>
+              </w:rPr>
+              <w:t>Cotton area</w:t>
+            </w:r>
+            <w:r>
+              <w:rPr>
+                <w:rFonts w:ascii="Times New Roman" w:hAnsi="Times New Roman" w:cs="Times New Roman"/>
+                <w:highlight w:val="yellow"/>
+              </w:rPr>
+              <w:t xml:space="preserve"> US</w:t>
+            </w:r>
+          </w:p>
+        </w:tc>
+        <w:tc>
+          <w:tcPr>
+            <w:tcW w:w="3117" w:type="dxa"/>
+          </w:tcPr>
+          <w:p>
+            <w:pPr>
+              <w:tabs>
+                <w:tab w:val="left" w:pos="1285"/>
+              </w:tabs>
+              <w:rPr>
+                <w:rFonts w:ascii="Times New Roman" w:hAnsi="Times New Roman" w:cs="Times New Roman"/>
+                <w:highlight w:val="yellow"/>
+              </w:rPr>
+            </w:pPr>
+            <w:r>
+              <w:rPr>
+                <w:rFonts w:ascii="Times New Roman" w:hAnsi="Times New Roman" w:cs="Times New Roman"/>
+                <w:highlight w:val="yellow"/>
+              </w:rPr>
+              <w:t>Cotton area</w:t>
+            </w:r>
+            <w:r>
+              <w:rPr>
+                <w:rFonts w:ascii="Times New Roman" w:hAnsi="Times New Roman" w:cs="Times New Roman"/>
+                <w:highlight w:val="yellow"/>
+              </w:rPr>
+              <w:t xml:space="preserve"> US</w:t>
+            </w:r>
+          </w:p>
+        </w:tc>
+        <w:tc>
+          <w:tcPr>
+            <w:tcW w:w="3117" w:type="dxa"/>
+          </w:tcPr>
+          <w:p>
+            <w:pPr>
+              <w:tabs>
+                <w:tab w:val="left" w:pos="1285"/>
+              </w:tabs>
+              <w:rPr>
+                <w:rFonts w:ascii="Times New Roman" w:hAnsi="Times New Roman" w:cs="Times New Roman"/>
+                <w:highlight w:val="yellow"/>
+              </w:rPr>
+            </w:pPr>
+            <w:r>
+              <w:rPr>
+                <w:rFonts w:ascii="Times New Roman" w:hAnsi="Times New Roman" w:cs="Times New Roman"/>
+                <w:highlight w:val="yellow"/>
+              </w:rPr>
+              <w:t xml:space="preserve">Total cotton area </w:t>
+            </w:r>
+            <w:r>
+              <w:rPr>
+                <w:rFonts w:ascii="Times New Roman" w:hAnsi="Times New Roman" w:cs="Times New Roman"/>
+                <w:highlight w:val="yellow"/>
+              </w:rPr>
+              <w:t>o</w:t>
+            </w:r>
+            <w:r>
+              <w:rPr>
+                <w:rFonts w:ascii="Times New Roman" w:hAnsi="Times New Roman" w:cs="Times New Roman"/>
+                <w:highlight w:val="yellow"/>
+              </w:rPr>
+              <w:t xml:space="preserve">n the </w:t>
+            </w:r>
+            <w:r>
+              <w:rPr>
+                <w:rFonts w:ascii="Times New Roman" w:hAnsi="Times New Roman" w:cs="Times New Roman"/>
+                <w:highlight w:val="yellow"/>
+              </w:rPr>
+              <w:t>US</w:t>
+            </w:r>
+            <w:r>
+              <w:rPr>
+                <w:rFonts w:ascii="Times New Roman" w:hAnsi="Times New Roman" w:cs="Times New Roman"/>
+                <w:highlight w:val="yellow"/>
+              </w:rPr>
+              <w:t xml:space="preserve"> side of the MRG basin (acres).</w:t>
             </w:r>
           </w:p>
         </w:tc>
@@ -2122,91 +2137,103 @@
               </w:tabs>
               <w:rPr>
                 <w:rFonts w:ascii="Times New Roman" w:hAnsi="Times New Roman" w:cs="Times New Roman"/>
-              </w:rPr>
-            </w:pPr>
-            <w:r>
-              <w:rPr>
-                <w:rFonts w:ascii="Times New Roman" w:hAnsi="Times New Roman" w:cs="Times New Roman"/>
-              </w:rPr>
-              <w:t>SW quality, TDS, site IBWC 13272</w:t>
-            </w:r>
-          </w:p>
-        </w:tc>
-        <w:tc>
-          <w:tcPr>
-            <w:tcW w:w="3117" w:type="dxa"/>
-          </w:tcPr>
-          <w:p>
-            <w:pPr>
-              <w:tabs>
-                <w:tab w:val="left" w:pos="1285"/>
-              </w:tabs>
-              <w:rPr>
-                <w:rFonts w:ascii="Times New Roman" w:hAnsi="Times New Roman" w:cs="Times New Roman"/>
-              </w:rPr>
-            </w:pPr>
-            <w:r>
-              <w:rPr>
-                <w:rFonts w:ascii="Times New Roman" w:hAnsi="Times New Roman" w:cs="Times New Roman"/>
-              </w:rPr>
-              <w:t>S</w:t>
-            </w:r>
-            <w:r>
-              <w:rPr>
-                <w:rFonts w:ascii="Times New Roman" w:hAnsi="Times New Roman" w:cs="Times New Roman"/>
-              </w:rPr>
-              <w:t xml:space="preserve">W </w:t>
-            </w:r>
-            <w:r>
-              <w:rPr>
-                <w:rFonts w:ascii="Times New Roman" w:hAnsi="Times New Roman" w:cs="Times New Roman"/>
-              </w:rPr>
-              <w:t>quality (</w:t>
-            </w:r>
-            <w:r>
-              <w:rPr>
-                <w:rFonts w:ascii="Times New Roman" w:hAnsi="Times New Roman" w:cs="Times New Roman"/>
-              </w:rPr>
-              <w:t>Mesilla</w:t>
-            </w:r>
-            <w:r>
-              <w:rPr>
-                <w:rFonts w:ascii="Times New Roman" w:hAnsi="Times New Roman" w:cs="Times New Roman"/>
-              </w:rPr>
-              <w:t>)</w:t>
-            </w:r>
-          </w:p>
-        </w:tc>
-        <w:tc>
-          <w:tcPr>
-            <w:tcW w:w="3117" w:type="dxa"/>
-          </w:tcPr>
-          <w:p>
-            <w:pPr>
-              <w:tabs>
-                <w:tab w:val="left" w:pos="1285"/>
-              </w:tabs>
-              <w:rPr>
-                <w:rFonts w:ascii="Times New Roman" w:hAnsi="Times New Roman" w:cs="Times New Roman"/>
-              </w:rPr>
-            </w:pPr>
-            <w:r>
-              <w:rPr>
-                <w:rFonts w:ascii="Times New Roman" w:hAnsi="Times New Roman" w:cs="Times New Roman"/>
-              </w:rPr>
-              <w:t>Surface water quality in terms of Total Dissolved Solids (TDS) for site IBWC-132</w:t>
-            </w:r>
-            <w:r>
-              <w:rPr>
-                <w:rFonts w:ascii="Times New Roman" w:hAnsi="Times New Roman" w:cs="Times New Roman"/>
-              </w:rPr>
-              <w:t>72</w:t>
-            </w:r>
-            <w:r>
-              <w:rPr>
-                <w:rFonts w:ascii="Times New Roman" w:hAnsi="Times New Roman" w:cs="Times New Roman"/>
-              </w:rPr>
-              <w:t xml:space="preserve"> in the Hueco-Mesilla Bolson aquifer on the U.S. side in El Paso (mg/L).</w:t>
+                <w:highlight w:val="yellow"/>
+              </w:rPr>
+            </w:pPr>
+            <w:r>
+              <w:rPr>
+                <w:rFonts w:ascii="Times New Roman" w:hAnsi="Times New Roman" w:cs="Times New Roman"/>
+                <w:highlight w:val="yellow"/>
+              </w:rPr>
+              <w:t>Urban area</w:t>
+            </w:r>
+            <w:r>
+              <w:rPr>
+                <w:rFonts w:ascii="Times New Roman" w:hAnsi="Times New Roman" w:cs="Times New Roman"/>
+                <w:highlight w:val="yellow"/>
+              </w:rPr>
+              <w:t xml:space="preserve"> US</w:t>
+            </w:r>
+          </w:p>
+        </w:tc>
+        <w:tc>
+          <w:tcPr>
+            <w:tcW w:w="3117" w:type="dxa"/>
+          </w:tcPr>
+          <w:p>
+            <w:pPr>
+              <w:tabs>
+                <w:tab w:val="left" w:pos="1285"/>
+              </w:tabs>
+              <w:rPr>
+                <w:rFonts w:ascii="Times New Roman" w:hAnsi="Times New Roman" w:cs="Times New Roman"/>
+                <w:highlight w:val="yellow"/>
+              </w:rPr>
+            </w:pPr>
+            <w:r>
+              <w:rPr>
+                <w:rFonts w:ascii="Times New Roman" w:hAnsi="Times New Roman" w:cs="Times New Roman"/>
+                <w:highlight w:val="yellow"/>
+              </w:rPr>
+              <w:t>Urban area</w:t>
+            </w:r>
+            <w:r>
+              <w:rPr>
+                <w:rFonts w:ascii="Times New Roman" w:hAnsi="Times New Roman" w:cs="Times New Roman"/>
+                <w:highlight w:val="yellow"/>
+              </w:rPr>
+              <w:t xml:space="preserve"> US</w:t>
+            </w:r>
+          </w:p>
+        </w:tc>
+        <w:tc>
+          <w:tcPr>
+            <w:tcW w:w="3117" w:type="dxa"/>
+          </w:tcPr>
+          <w:p>
+            <w:pPr>
+              <w:tabs>
+                <w:tab w:val="left" w:pos="1285"/>
+              </w:tabs>
+              <w:rPr>
+                <w:rFonts w:ascii="Times New Roman" w:hAnsi="Times New Roman" w:cs="Times New Roman"/>
+                <w:highlight w:val="yellow"/>
+              </w:rPr>
+            </w:pPr>
+            <w:r>
+              <w:rPr>
+                <w:rFonts w:ascii="Times New Roman" w:hAnsi="Times New Roman" w:cs="Times New Roman"/>
+                <w:highlight w:val="yellow"/>
+              </w:rPr>
+              <w:t xml:space="preserve">Total urban area </w:t>
+            </w:r>
+            <w:r>
+              <w:rPr>
+                <w:rFonts w:ascii="Times New Roman" w:hAnsi="Times New Roman" w:cs="Times New Roman"/>
+                <w:highlight w:val="yellow"/>
+              </w:rPr>
+              <w:t>o</w:t>
+            </w:r>
+            <w:r>
+              <w:rPr>
+                <w:rFonts w:ascii="Times New Roman" w:hAnsi="Times New Roman" w:cs="Times New Roman"/>
+                <w:highlight w:val="yellow"/>
+              </w:rPr>
+              <w:t xml:space="preserve">n the </w:t>
+            </w:r>
+            <w:r>
+              <w:rPr>
+                <w:rFonts w:ascii="Times New Roman" w:hAnsi="Times New Roman" w:cs="Times New Roman"/>
+                <w:highlight w:val="yellow"/>
+              </w:rPr>
+              <w:t>US</w:t>
+            </w:r>
+            <w:r>
+              <w:rPr>
+                <w:rFonts w:ascii="Times New Roman" w:hAnsi="Times New Roman" w:cs="Times New Roman"/>
+                <w:highlight w:val="yellow"/>
+              </w:rPr>
+              <w:t xml:space="preserve"> side of the MRG basin (acres).</w:t>
             </w:r>
           </w:p>
         </w:tc>
@@ -2223,6 +2250,634 @@
               </w:tabs>
               <w:rPr>
                 <w:rFonts w:ascii="Times New Roman" w:hAnsi="Times New Roman" w:cs="Times New Roman"/>
+                <w:highlight w:val="yellow"/>
+              </w:rPr>
+            </w:pPr>
+            <w:r>
+              <w:rPr>
+                <w:rFonts w:ascii="Times New Roman" w:hAnsi="Times New Roman" w:cs="Times New Roman"/>
+                <w:highlight w:val="yellow"/>
+              </w:rPr>
+              <w:t>Alfalfa area</w:t>
+            </w:r>
+            <w:r>
+              <w:rPr>
+                <w:rFonts w:ascii="Times New Roman" w:hAnsi="Times New Roman" w:cs="Times New Roman"/>
+                <w:highlight w:val="yellow"/>
+              </w:rPr>
+              <w:t xml:space="preserve"> US</w:t>
+            </w:r>
+          </w:p>
+        </w:tc>
+        <w:tc>
+          <w:tcPr>
+            <w:tcW w:w="3117" w:type="dxa"/>
+          </w:tcPr>
+          <w:p>
+            <w:pPr>
+              <w:tabs>
+                <w:tab w:val="left" w:pos="1285"/>
+              </w:tabs>
+              <w:rPr>
+                <w:rFonts w:ascii="Times New Roman" w:hAnsi="Times New Roman" w:cs="Times New Roman"/>
+                <w:highlight w:val="yellow"/>
+              </w:rPr>
+            </w:pPr>
+            <w:r>
+              <w:rPr>
+                <w:rFonts w:ascii="Times New Roman" w:hAnsi="Times New Roman" w:cs="Times New Roman"/>
+                <w:highlight w:val="yellow"/>
+              </w:rPr>
+              <w:t>Alfalfa area</w:t>
+            </w:r>
+            <w:r>
+              <w:rPr>
+                <w:rFonts w:ascii="Times New Roman" w:hAnsi="Times New Roman" w:cs="Times New Roman"/>
+                <w:highlight w:val="yellow"/>
+              </w:rPr>
+              <w:t xml:space="preserve"> US</w:t>
+            </w:r>
+          </w:p>
+        </w:tc>
+        <w:tc>
+          <w:tcPr>
+            <w:tcW w:w="3117" w:type="dxa"/>
+          </w:tcPr>
+          <w:p>
+            <w:pPr>
+              <w:tabs>
+                <w:tab w:val="left" w:pos="1285"/>
+              </w:tabs>
+              <w:rPr>
+                <w:rFonts w:ascii="Times New Roman" w:hAnsi="Times New Roman" w:cs="Times New Roman"/>
+                <w:highlight w:val="yellow"/>
+              </w:rPr>
+            </w:pPr>
+            <w:r>
+              <w:rPr>
+                <w:rFonts w:ascii="Times New Roman" w:hAnsi="Times New Roman" w:cs="Times New Roman"/>
+                <w:highlight w:val="yellow"/>
+              </w:rPr>
+              <w:t xml:space="preserve">Total pecan area </w:t>
+            </w:r>
+            <w:r>
+              <w:rPr>
+                <w:rFonts w:ascii="Times New Roman" w:hAnsi="Times New Roman" w:cs="Times New Roman"/>
+                <w:highlight w:val="yellow"/>
+              </w:rPr>
+              <w:t>o</w:t>
+            </w:r>
+            <w:r>
+              <w:rPr>
+                <w:rFonts w:ascii="Times New Roman" w:hAnsi="Times New Roman" w:cs="Times New Roman"/>
+                <w:highlight w:val="yellow"/>
+              </w:rPr>
+              <w:t xml:space="preserve">n the </w:t>
+            </w:r>
+            <w:r>
+              <w:rPr>
+                <w:rFonts w:ascii="Times New Roman" w:hAnsi="Times New Roman" w:cs="Times New Roman"/>
+                <w:highlight w:val="yellow"/>
+              </w:rPr>
+              <w:t>US</w:t>
+            </w:r>
+            <w:r>
+              <w:rPr>
+                <w:rFonts w:ascii="Times New Roman" w:hAnsi="Times New Roman" w:cs="Times New Roman"/>
+                <w:highlight w:val="yellow"/>
+              </w:rPr>
+              <w:t xml:space="preserve"> side of the MRG basin (acres).</w:t>
+            </w:r>
+          </w:p>
+        </w:tc>
+      </w:tr>
+      <w:tr>
+        <w:tc>
+          <w:tcPr>
+            <w:tcW w:w="3116" w:type="dxa"/>
+          </w:tcPr>
+          <w:p>
+            <w:pPr>
+              <w:tabs>
+                <w:tab w:val="left" w:pos="1285"/>
+              </w:tabs>
+              <w:rPr>
+                <w:rFonts w:ascii="Times New Roman" w:hAnsi="Times New Roman" w:cs="Times New Roman"/>
+              </w:rPr>
+            </w:pPr>
+            <w:r>
+              <w:rPr>
+                <w:rFonts w:ascii="Times New Roman" w:hAnsi="Times New Roman" w:cs="Times New Roman"/>
+              </w:rPr>
+              <w:t>GW availability,  well   #4904480</w:t>
+            </w:r>
+          </w:p>
+        </w:tc>
+        <w:tc>
+          <w:tcPr>
+            <w:tcW w:w="3117" w:type="dxa"/>
+          </w:tcPr>
+          <w:p>
+            <w:pPr>
+              <w:tabs>
+                <w:tab w:val="left" w:pos="1285"/>
+              </w:tabs>
+              <w:rPr>
+                <w:rFonts w:ascii="Times New Roman" w:hAnsi="Times New Roman" w:cs="Times New Roman"/>
+              </w:rPr>
+            </w:pPr>
+            <w:r>
+              <w:rPr>
+                <w:rFonts w:ascii="Times New Roman" w:hAnsi="Times New Roman" w:cs="Times New Roman"/>
+              </w:rPr>
+              <w:t xml:space="preserve">GW </w:t>
+            </w:r>
+            <w:r>
+              <w:rPr>
+                <w:rFonts w:ascii="Times New Roman" w:hAnsi="Times New Roman" w:cs="Times New Roman"/>
+              </w:rPr>
+              <w:t>supply (Mesilla</w:t>
+            </w:r>
+            <w:r>
+              <w:rPr>
+                <w:rFonts w:ascii="Times New Roman" w:hAnsi="Times New Roman" w:cs="Times New Roman"/>
+              </w:rPr>
+              <w:t>)</w:t>
+            </w:r>
+          </w:p>
+        </w:tc>
+        <w:tc>
+          <w:tcPr>
+            <w:tcW w:w="3117" w:type="dxa"/>
+          </w:tcPr>
+          <w:p>
+            <w:pPr>
+              <w:tabs>
+                <w:tab w:val="left" w:pos="1285"/>
+              </w:tabs>
+              <w:rPr>
+                <w:rFonts w:ascii="Times New Roman" w:hAnsi="Times New Roman" w:cs="Times New Roman"/>
+              </w:rPr>
+            </w:pPr>
+            <w:r>
+              <w:rPr>
+                <w:rFonts w:ascii="Times New Roman" w:hAnsi="Times New Roman" w:cs="Times New Roman"/>
+              </w:rPr>
+              <w:t>Groundwater availability (well #4904480) in the Mesilla Bolson aquifer in El Paso (ft below land surface).</w:t>
+            </w:r>
+          </w:p>
+        </w:tc>
+      </w:tr>
+      <w:tr>
+        <w:tc>
+          <w:tcPr>
+            <w:tcW w:w="3116" w:type="dxa"/>
+          </w:tcPr>
+          <w:p>
+            <w:pPr>
+              <w:tabs>
+                <w:tab w:val="left" w:pos="1285"/>
+              </w:tabs>
+              <w:rPr>
+                <w:rFonts w:ascii="Times New Roman" w:hAnsi="Times New Roman" w:cs="Times New Roman"/>
+              </w:rPr>
+            </w:pPr>
+            <w:r>
+              <w:rPr>
+                <w:rFonts w:ascii="Times New Roman" w:hAnsi="Times New Roman" w:cs="Times New Roman"/>
+              </w:rPr>
+              <w:t>GW availability, well #4913301</w:t>
+            </w:r>
+          </w:p>
+        </w:tc>
+        <w:tc>
+          <w:tcPr>
+            <w:tcW w:w="3117" w:type="dxa"/>
+          </w:tcPr>
+          <w:p>
+            <w:pPr>
+              <w:tabs>
+                <w:tab w:val="left" w:pos="1285"/>
+              </w:tabs>
+              <w:rPr>
+                <w:rFonts w:ascii="Times New Roman" w:hAnsi="Times New Roman" w:cs="Times New Roman"/>
+              </w:rPr>
+            </w:pPr>
+            <w:r>
+              <w:rPr>
+                <w:rFonts w:ascii="Times New Roman" w:hAnsi="Times New Roman" w:cs="Times New Roman"/>
+              </w:rPr>
+              <w:t xml:space="preserve">GW </w:t>
+            </w:r>
+            <w:r>
+              <w:rPr>
+                <w:rFonts w:ascii="Times New Roman" w:hAnsi="Times New Roman" w:cs="Times New Roman"/>
+              </w:rPr>
+              <w:t>supply</w:t>
+            </w:r>
+            <w:r>
+              <w:rPr>
+                <w:rFonts w:ascii="Times New Roman" w:hAnsi="Times New Roman" w:cs="Times New Roman"/>
+              </w:rPr>
+              <w:t xml:space="preserve"> (</w:t>
+            </w:r>
+            <w:r>
+              <w:rPr>
+                <w:rFonts w:ascii="Times New Roman" w:hAnsi="Times New Roman" w:cs="Times New Roman"/>
+              </w:rPr>
+              <w:t>Hueco</w:t>
+            </w:r>
+            <w:r>
+              <w:rPr>
+                <w:rFonts w:ascii="Times New Roman" w:hAnsi="Times New Roman" w:cs="Times New Roman"/>
+              </w:rPr>
+              <w:t>)</w:t>
+            </w:r>
+          </w:p>
+        </w:tc>
+        <w:tc>
+          <w:tcPr>
+            <w:tcW w:w="3117" w:type="dxa"/>
+          </w:tcPr>
+          <w:p>
+            <w:pPr>
+              <w:tabs>
+                <w:tab w:val="left" w:pos="1285"/>
+              </w:tabs>
+              <w:rPr>
+                <w:rFonts w:ascii="Times New Roman" w:hAnsi="Times New Roman" w:cs="Times New Roman"/>
+              </w:rPr>
+            </w:pPr>
+            <w:r>
+              <w:rPr>
+                <w:rFonts w:ascii="Times New Roman" w:hAnsi="Times New Roman" w:cs="Times New Roman"/>
+              </w:rPr>
+              <w:t>Groundwater availability (well #4913301) in the Hueco Bolson aquifer in El Paso (ft below land surface).</w:t>
+            </w:r>
+          </w:p>
+        </w:tc>
+      </w:tr>
+      <w:tr>
+        <w:tc>
+          <w:tcPr>
+            <w:tcW w:w="3116" w:type="dxa"/>
+          </w:tcPr>
+          <w:p>
+            <w:pPr>
+              <w:tabs>
+                <w:tab w:val="left" w:pos="1285"/>
+              </w:tabs>
+              <w:rPr>
+                <w:rFonts w:ascii="Times New Roman" w:hAnsi="Times New Roman" w:cs="Times New Roman"/>
+              </w:rPr>
+            </w:pPr>
+            <w:r>
+              <w:rPr>
+                <w:rFonts w:ascii="Times New Roman" w:hAnsi="Times New Roman" w:cs="Times New Roman"/>
+              </w:rPr>
+              <w:t>GW quality, TDS, well #4914417</w:t>
+            </w:r>
+          </w:p>
+        </w:tc>
+        <w:tc>
+          <w:tcPr>
+            <w:tcW w:w="3117" w:type="dxa"/>
+          </w:tcPr>
+          <w:p>
+            <w:pPr>
+              <w:tabs>
+                <w:tab w:val="left" w:pos="1285"/>
+              </w:tabs>
+              <w:rPr>
+                <w:rFonts w:ascii="Times New Roman" w:hAnsi="Times New Roman" w:cs="Times New Roman"/>
+              </w:rPr>
+            </w:pPr>
+            <w:r>
+              <w:rPr>
+                <w:rFonts w:ascii="Times New Roman" w:hAnsi="Times New Roman" w:cs="Times New Roman"/>
+              </w:rPr>
+              <w:t>GW quality (</w:t>
+            </w:r>
+            <w:r>
+              <w:rPr>
+                <w:rFonts w:ascii="Times New Roman" w:hAnsi="Times New Roman" w:cs="Times New Roman"/>
+              </w:rPr>
+              <w:t>Hueco</w:t>
+            </w:r>
+            <w:r>
+              <w:rPr>
+                <w:rFonts w:ascii="Times New Roman" w:hAnsi="Times New Roman" w:cs="Times New Roman"/>
+              </w:rPr>
+              <w:t>)</w:t>
+            </w:r>
+          </w:p>
+        </w:tc>
+        <w:tc>
+          <w:tcPr>
+            <w:tcW w:w="3117" w:type="dxa"/>
+          </w:tcPr>
+          <w:p>
+            <w:pPr>
+              <w:tabs>
+                <w:tab w:val="left" w:pos="1285"/>
+              </w:tabs>
+              <w:rPr>
+                <w:rFonts w:ascii="Times New Roman" w:hAnsi="Times New Roman" w:cs="Times New Roman"/>
+              </w:rPr>
+            </w:pPr>
+            <w:r>
+              <w:rPr>
+                <w:rFonts w:ascii="Times New Roman" w:hAnsi="Times New Roman" w:cs="Times New Roman"/>
+              </w:rPr>
+              <w:t>Groundwater quality (TDS, well #4914417) in the Hueco Bolson aquifer in El Paso (mg/L).</w:t>
+            </w:r>
+          </w:p>
+        </w:tc>
+      </w:tr>
+      <w:tr>
+        <w:tc>
+          <w:tcPr>
+            <w:tcW w:w="3116" w:type="dxa"/>
+          </w:tcPr>
+          <w:p>
+            <w:pPr>
+              <w:tabs>
+                <w:tab w:val="left" w:pos="1285"/>
+              </w:tabs>
+              <w:rPr>
+                <w:rFonts w:ascii="Times New Roman" w:hAnsi="Times New Roman" w:cs="Times New Roman"/>
+              </w:rPr>
+            </w:pPr>
+            <w:r>
+              <w:rPr>
+                <w:rFonts w:ascii="Times New Roman" w:hAnsi="Times New Roman" w:cs="Times New Roman"/>
+              </w:rPr>
+              <w:t>SW availability, El Paso</w:t>
+            </w:r>
+          </w:p>
+        </w:tc>
+        <w:tc>
+          <w:tcPr>
+            <w:tcW w:w="3117" w:type="dxa"/>
+          </w:tcPr>
+          <w:p>
+            <w:pPr>
+              <w:tabs>
+                <w:tab w:val="left" w:pos="1285"/>
+              </w:tabs>
+              <w:rPr>
+                <w:rFonts w:ascii="Times New Roman" w:hAnsi="Times New Roman" w:cs="Times New Roman"/>
+              </w:rPr>
+            </w:pPr>
+            <w:r>
+              <w:rPr>
+                <w:rFonts w:ascii="Times New Roman" w:hAnsi="Times New Roman" w:cs="Times New Roman"/>
+              </w:rPr>
+              <w:t>SW supply (EPNo.1)</w:t>
+            </w:r>
+          </w:p>
+        </w:tc>
+        <w:tc>
+          <w:tcPr>
+            <w:tcW w:w="3117" w:type="dxa"/>
+          </w:tcPr>
+          <w:p>
+            <w:pPr>
+              <w:tabs>
+                <w:tab w:val="left" w:pos="1285"/>
+              </w:tabs>
+              <w:rPr>
+                <w:rFonts w:ascii="Times New Roman" w:hAnsi="Times New Roman" w:cs="Times New Roman"/>
+              </w:rPr>
+            </w:pPr>
+            <w:r>
+              <w:rPr>
+                <w:rFonts w:ascii="Times New Roman" w:hAnsi="Times New Roman" w:cs="Times New Roman"/>
+              </w:rPr>
+              <w:t>Surface water availability in El Paso County Water Improvement District number 1 (acre-ft)</w:t>
+            </w:r>
+          </w:p>
+        </w:tc>
+      </w:tr>
+      <w:tr>
+        <w:tc>
+          <w:tcPr>
+            <w:tcW w:w="3116" w:type="dxa"/>
+          </w:tcPr>
+          <w:p>
+            <w:pPr>
+              <w:tabs>
+                <w:tab w:val="left" w:pos="1285"/>
+              </w:tabs>
+              <w:rPr>
+                <w:rFonts w:ascii="Times New Roman" w:hAnsi="Times New Roman" w:cs="Times New Roman"/>
+              </w:rPr>
+            </w:pPr>
+            <w:r>
+              <w:rPr>
+                <w:rFonts w:ascii="Times New Roman" w:hAnsi="Times New Roman" w:cs="Times New Roman"/>
+              </w:rPr>
+              <w:t>SW availability, Elephant Butte</w:t>
+            </w:r>
+          </w:p>
+        </w:tc>
+        <w:tc>
+          <w:tcPr>
+            <w:tcW w:w="3117" w:type="dxa"/>
+          </w:tcPr>
+          <w:p>
+            <w:pPr>
+              <w:tabs>
+                <w:tab w:val="left" w:pos="1285"/>
+              </w:tabs>
+              <w:rPr>
+                <w:rFonts w:ascii="Times New Roman" w:hAnsi="Times New Roman" w:cs="Times New Roman"/>
+              </w:rPr>
+            </w:pPr>
+            <w:r>
+              <w:rPr>
+                <w:rFonts w:ascii="Times New Roman" w:hAnsi="Times New Roman" w:cs="Times New Roman"/>
+              </w:rPr>
+              <w:t>SW supply (EBID)</w:t>
+            </w:r>
+          </w:p>
+        </w:tc>
+        <w:tc>
+          <w:tcPr>
+            <w:tcW w:w="3117" w:type="dxa"/>
+          </w:tcPr>
+          <w:p>
+            <w:pPr>
+              <w:tabs>
+                <w:tab w:val="left" w:pos="1285"/>
+              </w:tabs>
+              <w:rPr>
+                <w:rFonts w:ascii="Times New Roman" w:hAnsi="Times New Roman" w:cs="Times New Roman"/>
+              </w:rPr>
+            </w:pPr>
+            <w:r>
+              <w:rPr>
+                <w:rFonts w:ascii="Times New Roman" w:hAnsi="Times New Roman" w:cs="Times New Roman"/>
+              </w:rPr>
+              <w:t>Surface water availability in Elephant Butte Irrigation District (acre-ft)</w:t>
+            </w:r>
+          </w:p>
+        </w:tc>
+      </w:tr>
+      <w:tr>
+        <w:tc>
+          <w:tcPr>
+            <w:tcW w:w="3116" w:type="dxa"/>
+          </w:tcPr>
+          <w:p>
+            <w:pPr>
+              <w:tabs>
+                <w:tab w:val="left" w:pos="1285"/>
+              </w:tabs>
+              <w:rPr>
+                <w:rFonts w:ascii="Times New Roman" w:hAnsi="Times New Roman" w:cs="Times New Roman"/>
+              </w:rPr>
+            </w:pPr>
+            <w:r>
+              <w:rPr>
+                <w:rFonts w:ascii="Times New Roman" w:hAnsi="Times New Roman" w:cs="Times New Roman"/>
+              </w:rPr>
+              <w:t>SW availability, Juarez</w:t>
+            </w:r>
+          </w:p>
+        </w:tc>
+        <w:tc>
+          <w:tcPr>
+            <w:tcW w:w="3117" w:type="dxa"/>
+          </w:tcPr>
+          <w:p>
+            <w:pPr>
+              <w:tabs>
+                <w:tab w:val="left" w:pos="1285"/>
+              </w:tabs>
+              <w:rPr>
+                <w:rFonts w:ascii="Times New Roman" w:hAnsi="Times New Roman" w:cs="Times New Roman"/>
+              </w:rPr>
+            </w:pPr>
+            <w:r>
+              <w:rPr>
+                <w:rFonts w:ascii="Times New Roman" w:hAnsi="Times New Roman" w:cs="Times New Roman"/>
+              </w:rPr>
+              <w:t>SW supply (Juarez)</w:t>
+            </w:r>
+          </w:p>
+        </w:tc>
+        <w:tc>
+          <w:tcPr>
+            <w:tcW w:w="3117" w:type="dxa"/>
+          </w:tcPr>
+          <w:p>
+            <w:pPr>
+              <w:tabs>
+                <w:tab w:val="left" w:pos="1285"/>
+              </w:tabs>
+              <w:rPr>
+                <w:rFonts w:ascii="Times New Roman" w:hAnsi="Times New Roman" w:cs="Times New Roman"/>
+              </w:rPr>
+            </w:pPr>
+            <w:r>
+              <w:rPr>
+                <w:rFonts w:ascii="Times New Roman" w:hAnsi="Times New Roman" w:cs="Times New Roman"/>
+              </w:rPr>
+              <w:t>Surface water availability in Ciudad Juarez (acre-ft)</w:t>
+            </w:r>
+          </w:p>
+        </w:tc>
+      </w:tr>
+      <w:tr>
+        <w:tc>
+          <w:tcPr>
+            <w:tcW w:w="3116" w:type="dxa"/>
+          </w:tcPr>
+          <w:p>
+            <w:pPr>
+              <w:tabs>
+                <w:tab w:val="left" w:pos="1285"/>
+              </w:tabs>
+              <w:rPr>
+                <w:rFonts w:ascii="Times New Roman" w:hAnsi="Times New Roman" w:cs="Times New Roman"/>
+              </w:rPr>
+            </w:pPr>
+            <w:r>
+              <w:rPr>
+                <w:rFonts w:ascii="Times New Roman" w:hAnsi="Times New Roman" w:cs="Times New Roman"/>
+              </w:rPr>
+              <w:t>SW quality, TDS, site IBWC 13272</w:t>
+            </w:r>
+          </w:p>
+        </w:tc>
+        <w:tc>
+          <w:tcPr>
+            <w:tcW w:w="3117" w:type="dxa"/>
+          </w:tcPr>
+          <w:p>
+            <w:pPr>
+              <w:tabs>
+                <w:tab w:val="left" w:pos="1285"/>
+              </w:tabs>
+              <w:rPr>
+                <w:rFonts w:ascii="Times New Roman" w:hAnsi="Times New Roman" w:cs="Times New Roman"/>
+              </w:rPr>
+            </w:pPr>
+            <w:r>
+              <w:rPr>
+                <w:rFonts w:ascii="Times New Roman" w:hAnsi="Times New Roman" w:cs="Times New Roman"/>
+              </w:rPr>
+              <w:t>SW quality (</w:t>
+            </w:r>
+            <w:r>
+              <w:rPr>
+                <w:rFonts w:ascii="Times New Roman" w:hAnsi="Times New Roman" w:cs="Times New Roman"/>
+              </w:rPr>
+              <w:t>Mesilla</w:t>
+            </w:r>
+            <w:r>
+              <w:rPr>
+                <w:rFonts w:ascii="Times New Roman" w:hAnsi="Times New Roman" w:cs="Times New Roman"/>
+              </w:rPr>
+              <w:t>)</w:t>
+            </w:r>
+          </w:p>
+        </w:tc>
+        <w:tc>
+          <w:tcPr>
+            <w:tcW w:w="3117" w:type="dxa"/>
+          </w:tcPr>
+          <w:p>
+            <w:pPr>
+              <w:tabs>
+                <w:tab w:val="left" w:pos="1285"/>
+              </w:tabs>
+              <w:rPr>
+                <w:rFonts w:ascii="Times New Roman" w:hAnsi="Times New Roman" w:cs="Times New Roman"/>
+              </w:rPr>
+            </w:pPr>
+            <w:r>
+              <w:rPr>
+                <w:rFonts w:ascii="Times New Roman" w:hAnsi="Times New Roman" w:cs="Times New Roman"/>
+              </w:rPr>
+              <w:t>Surface water quality (TDS, site IBWC-13272) NW of El Paso (mg/L).</w:t>
+            </w:r>
+          </w:p>
+        </w:tc>
+      </w:tr>
+      <w:tr>
+        <w:tc>
+          <w:tcPr>
+            <w:tcW w:w="3116" w:type="dxa"/>
+          </w:tcPr>
+          <w:p>
+            <w:pPr>
+              <w:tabs>
+                <w:tab w:val="left" w:pos="1285"/>
+              </w:tabs>
+              <w:rPr>
+                <w:rFonts w:ascii="Times New Roman" w:hAnsi="Times New Roman" w:cs="Times New Roman"/>
               </w:rPr>
             </w:pPr>
             <w:r>
@@ -2250,19 +2905,7 @@
               <w:rPr>
                 <w:rFonts w:ascii="Times New Roman" w:hAnsi="Times New Roman" w:cs="Times New Roman"/>
               </w:rPr>
-              <w:t>S</w:t>
-            </w:r>
-            <w:r>
-              <w:rPr>
-                <w:rFonts w:ascii="Times New Roman" w:hAnsi="Times New Roman" w:cs="Times New Roman"/>
-              </w:rPr>
-              <w:t xml:space="preserve">W </w:t>
-            </w:r>
-            <w:r>
-              <w:rPr>
-                <w:rFonts w:ascii="Times New Roman" w:hAnsi="Times New Roman" w:cs="Times New Roman"/>
-              </w:rPr>
-              <w:t>quality (</w:t>
+              <w:t>SW quality (</w:t>
             </w:r>
             <w:r>
               <w:rPr>
@@ -2295,19 +2938,7 @@
               <w:rPr>
                 <w:rFonts w:ascii="Times New Roman" w:hAnsi="Times New Roman" w:cs="Times New Roman"/>
               </w:rPr>
-              <w:t>Surface water quality in terms of Total Dissolved Solids (TDS) for site IBWC-1</w:t>
-            </w:r>
-            <w:r>
-              <w:rPr>
-                <w:rFonts w:ascii="Times New Roman" w:hAnsi="Times New Roman" w:cs="Times New Roman"/>
-              </w:rPr>
-              <w:t>4465</w:t>
-            </w:r>
-            <w:r>
-              <w:rPr>
-                <w:rFonts w:ascii="Times New Roman" w:hAnsi="Times New Roman" w:cs="Times New Roman"/>
-              </w:rPr>
-              <w:t xml:space="preserve"> in the Hueco-Mesilla Bolson aquifer on the U.S. side in El Paso (mg/L).</w:t>
+              <w:t>Surface water quality (TDS, site IBWC-14465) SE of El Paso (mg/L).</w:t>
             </w:r>
           </w:p>
         </w:tc>
@@ -3562,4 +4193,271 @@
     </a:ext>
   </a:extLst>
 </a:theme>
+</file>
+
+<file path=customXml/item1.xml><?xml version="1.0" encoding="utf-8"?>
+<p:properties xmlns:p="http://schemas.microsoft.com/office/2006/metadata/properties" xmlns:xsi="http://www.w3.org/2001/XMLSchema-instance" xmlns:pc="http://schemas.microsoft.com/office/infopath/2007/PartnerControls">
+  <documentManagement>
+    <lcf76f155ced4ddcb4097134ff3c332f xmlns="26585f66-47fc-498d-b213-b46953568bdc">
+      <Terms xmlns="http://schemas.microsoft.com/office/infopath/2007/PartnerControls"/>
+    </lcf76f155ced4ddcb4097134ff3c332f>
+  </documentManagement>
+</p:properties>
+</file>
+
+<file path=customXml/item2.xml><?xml version="1.0" encoding="utf-8"?>
+<ct:contentTypeSchema xmlns:ct="http://schemas.microsoft.com/office/2006/metadata/contentType" xmlns:ma="http://schemas.microsoft.com/office/2006/metadata/properties/metaAttributes" ct:_="" ma:_="" ma:contentTypeName="Document" ma:contentTypeID="0x010100C0C065D4DE56964884282D8F503EB12D" ma:contentTypeVersion="12" ma:contentTypeDescription="Create a new document." ma:contentTypeScope="" ma:versionID="cfa0f9876d3650d261453c6251028662">
+  <xsd:schema xmlns:xsd="http://www.w3.org/2001/XMLSchema" xmlns:xs="http://www.w3.org/2001/XMLSchema" xmlns:p="http://schemas.microsoft.com/office/2006/metadata/properties" xmlns:ns2="26585f66-47fc-498d-b213-b46953568bdc" xmlns:ns3="984dc5cf-9f96-4254-8c6c-2d4fc144aaf2" targetNamespace="http://schemas.microsoft.com/office/2006/metadata/properties" ma:root="true" ma:fieldsID="61f3943096767e2b3d869813e253bb59" ns2:_="" ns3:_="">
+    <xsd:import namespace="26585f66-47fc-498d-b213-b46953568bdc"/>
+    <xsd:import namespace="984dc5cf-9f96-4254-8c6c-2d4fc144aaf2"/>
+    <xsd:element name="properties">
+      <xsd:complexType>
+        <xsd:sequence>
+          <xsd:element name="documentManagement">
+            <xsd:complexType>
+              <xsd:all>
+                <xsd:element ref="ns2:MediaServiceMetadata" minOccurs="0"/>
+                <xsd:element ref="ns2:MediaServiceFastMetadata" minOccurs="0"/>
+                <xsd:element ref="ns2:MediaServiceObjectDetectorVersions" minOccurs="0"/>
+                <xsd:element ref="ns2:MediaServiceSearchProperties" minOccurs="0"/>
+                <xsd:element ref="ns3:SharedWithUsers" minOccurs="0"/>
+                <xsd:element ref="ns3:SharedWithDetails" minOccurs="0"/>
+                <xsd:element ref="ns2:lcf76f155ced4ddcb4097134ff3c332f" minOccurs="0"/>
+                <xsd:element ref="ns2:MediaServiceDateTaken" minOccurs="0"/>
+                <xsd:element ref="ns2:MediaServiceOCR" minOccurs="0"/>
+                <xsd:element ref="ns2:MediaServiceGenerationTime" minOccurs="0"/>
+                <xsd:element ref="ns2:MediaServiceEventHashCode" minOccurs="0"/>
+              </xsd:all>
+            </xsd:complexType>
+          </xsd:element>
+        </xsd:sequence>
+      </xsd:complexType>
+    </xsd:element>
+  </xsd:schema>
+  <xsd:schema xmlns:xsd="http://www.w3.org/2001/XMLSchema" xmlns:xs="http://www.w3.org/2001/XMLSchema" xmlns:dms="http://schemas.microsoft.com/office/2006/documentManagement/types" xmlns:pc="http://schemas.microsoft.com/office/infopath/2007/PartnerControls" targetNamespace="26585f66-47fc-498d-b213-b46953568bdc" elementFormDefault="qualified">
+    <xsd:import namespace="http://schemas.microsoft.com/office/2006/documentManagement/types"/>
+    <xsd:import namespace="http://schemas.microsoft.com/office/infopath/2007/PartnerControls"/>
+    <xsd:element name="MediaServiceMetadata" ma:index="8" nillable="true" ma:displayName="MediaServiceMetadata" ma:hidden="true" ma:internalName="MediaServiceMetadata" ma:readOnly="true">
+      <xsd:simpleType>
+        <xsd:restriction base="dms:Note"/>
+      </xsd:simpleType>
+    </xsd:element>
+    <xsd:element name="MediaServiceFastMetadata" ma:index="9" nillable="true" ma:displayName="MediaServiceFastMetadata" ma:hidden="true" ma:internalName="MediaServiceFastMetadata" ma:readOnly="true">
+      <xsd:simpleType>
+        <xsd:restriction base="dms:Note"/>
+      </xsd:simpleType>
+    </xsd:element>
+    <xsd:element name="MediaServiceObjectDetectorVersions" ma:index="10" nillable="true" ma:displayName="MediaServiceObjectDetectorVersions" ma:hidden="true" ma:indexed="true" ma:internalName="MediaServiceObjectDetectorVersions" ma:readOnly="true">
+      <xsd:simpleType>
+        <xsd:restriction base="dms:Text"/>
+      </xsd:simpleType>
+    </xsd:element>
+    <xsd:element name="MediaServiceSearchProperties" ma:index="11" nillable="true" ma:displayName="MediaServiceSearchProperties" ma:hidden="true" ma:internalName="MediaServiceSearchProperties" ma:readOnly="true">
+      <xsd:simpleType>
+        <xsd:restriction base="dms:Note"/>
+      </xsd:simpleType>
+    </xsd:element>
+    <xsd:element name="lcf76f155ced4ddcb4097134ff3c332f" ma:index="15" nillable="true" ma:taxonomy="true" ma:internalName="lcf76f155ced4ddcb4097134ff3c332f" ma:taxonomyFieldName="MediaServiceImageTags" ma:displayName="Image Tags" ma:readOnly="false" ma:fieldId="{5cf76f15-5ced-4ddc-b409-7134ff3c332f}" ma:taxonomyMulti="true" ma:sspId="ba7718bf-da1f-4f11-8a5d-37be31d8011b" ma:termSetId="09814cd3-568e-fe90-9814-8d621ff8fb84" ma:anchorId="fba54fb3-c3e1-fe81-a776-ca4b69148c4d" ma:open="true" ma:isKeyword="false">
+      <xsd:complexType>
+        <xsd:sequence>
+          <xsd:element ref="pc:Terms" minOccurs="0" maxOccurs="1"/>
+        </xsd:sequence>
+      </xsd:complexType>
+    </xsd:element>
+    <xsd:element name="MediaServiceDateTaken" ma:index="16" nillable="true" ma:displayName="MediaServiceDateTaken" ma:hidden="true" ma:indexed="true" ma:internalName="MediaServiceDateTaken" ma:readOnly="true">
+      <xsd:simpleType>
+        <xsd:restriction base="dms:Text"/>
+      </xsd:simpleType>
+    </xsd:element>
+    <xsd:element name="MediaServiceOCR" ma:index="17" nillable="true" ma:displayName="Extracted Text" ma:internalName="MediaServiceOCR" ma:readOnly="true">
+      <xsd:simpleType>
+        <xsd:restriction base="dms:Note">
+          <xsd:maxLength value="255"/>
+        </xsd:restriction>
+      </xsd:simpleType>
+    </xsd:element>
+    <xsd:element name="MediaServiceGenerationTime" ma:index="18" nillable="true" ma:displayName="MediaServiceGenerationTime" ma:hidden="true" ma:internalName="MediaServiceGenerationTime" ma:readOnly="true">
+      <xsd:simpleType>
+        <xsd:restriction base="dms:Text"/>
+      </xsd:simpleType>
+    </xsd:element>
+    <xsd:element name="MediaServiceEventHashCode" ma:index="19" nillable="true" ma:displayName="MediaServiceEventHashCode" ma:hidden="true" ma:internalName="MediaServiceEventHashCode" ma:readOnly="true">
+      <xsd:simpleType>
+        <xsd:restriction base="dms:Text"/>
+      </xsd:simpleType>
+    </xsd:element>
+  </xsd:schema>
+  <xsd:schema xmlns:xsd="http://www.w3.org/2001/XMLSchema" xmlns:xs="http://www.w3.org/2001/XMLSchema" xmlns:dms="http://schemas.microsoft.com/office/2006/documentManagement/types" xmlns:pc="http://schemas.microsoft.com/office/infopath/2007/PartnerControls" targetNamespace="984dc5cf-9f96-4254-8c6c-2d4fc144aaf2" elementFormDefault="qualified">
+    <xsd:import namespace="http://schemas.microsoft.com/office/2006/documentManagement/types"/>
+    <xsd:import namespace="http://schemas.microsoft.com/office/infopath/2007/PartnerControls"/>
+    <xsd:element name="SharedWithUsers" ma:index="12" nillable="true" ma:displayName="Shared With" ma:internalName="SharedWithUsers" ma:readOnly="true">
+      <xsd:complexType>
+        <xsd:complexContent>
+          <xsd:extension base="dms:UserMulti">
+            <xsd:sequence>
+              <xsd:element name="UserInfo" minOccurs="0" maxOccurs="unbounded">
+                <xsd:complexType>
+                  <xsd:sequence>
+                    <xsd:element name="DisplayName" type="xsd:string" minOccurs="0"/>
+                    <xsd:element name="AccountId" type="dms:UserId" minOccurs="0" nillable="true"/>
+                    <xsd:element name="AccountType" type="xsd:string" minOccurs="0"/>
+                  </xsd:sequence>
+                </xsd:complexType>
+              </xsd:element>
+            </xsd:sequence>
+          </xsd:extension>
+        </xsd:complexContent>
+      </xsd:complexType>
+    </xsd:element>
+    <xsd:element name="SharedWithDetails" ma:index="13" nillable="true" ma:displayName="Shared With Details" ma:internalName="SharedWithDetails" ma:readOnly="true">
+      <xsd:simpleType>
+        <xsd:restriction base="dms:Note">
+          <xsd:maxLength value="255"/>
+        </xsd:restriction>
+      </xsd:simpleType>
+    </xsd:element>
+  </xsd:schema>
+  <xsd:schema xmlns="http://schemas.openxmlformats.org/package/2006/metadata/core-properties" xmlns:xsd="http://www.w3.org/2001/XMLSchema" xmlns:xsi="http://www.w3.org/2001/XMLSchema-instance" xmlns:dc="http://purl.org/dc/elements/1.1/" xmlns:dcterms="http://purl.org/dc/terms/" xmlns:odoc="http://schemas.microsoft.com/internal/obd" targetNamespace="http://schemas.openxmlformats.org/package/2006/metadata/core-properties" elementFormDefault="qualified" attributeFormDefault="unqualified" blockDefault="#all">
+    <xsd:import namespace="http://purl.org/dc/elements/1.1/" schemaLocation="http://dublincore.org/schemas/xmls/qdc/2003/04/02/dc.xsd"/>
+    <xsd:import namespace="http://purl.org/dc/terms/" schemaLocation="http://dublincore.org/schemas/xmls/qdc/2003/04/02/dcterms.xsd"/>
+    <xsd:element name="coreProperties" type="CT_coreProperties"/>
+    <xsd:complexType name="CT_coreProperties">
+      <xsd:all>
+        <xsd:element ref="dc:creator" minOccurs="0" maxOccurs="1"/>
+        <xsd:element ref="dcterms:created" minOccurs="0" maxOccurs="1"/>
+        <xsd:element ref="dc:identifier" minOccurs="0" maxOccurs="1"/>
+        <xsd:element name="contentType" minOccurs="0" maxOccurs="1" type="xsd:string" ma:index="0" ma:displayName="Content Type"/>
+        <xsd:element ref="dc:title" minOccurs="0" maxOccurs="1" ma:index="4" ma:displayName="Title"/>
+        <xsd:element ref="dc:subject" minOccurs="0" maxOccurs="1"/>
+        <xsd:element ref="dc:description" minOccurs="0" maxOccurs="1"/>
+        <xsd:element name="keywords" minOccurs="0" maxOccurs="1" type="xsd:string"/>
+        <xsd:element ref="dc:language" minOccurs="0" maxOccurs="1"/>
+        <xsd:element name="category" minOccurs="0" maxOccurs="1" type="xsd:string"/>
+        <xsd:element name="version" minOccurs="0" maxOccurs="1" type="xsd:string"/>
+        <xsd:element name="revision" minOccurs="0" maxOccurs="1" type="xsd:string">
+          <xsd:annotation>
+            <xsd:documentation>
+                        This value indicates the number of saves or revisions. The application is responsible for updating this value after each revision.
+                    </xsd:documentation>
+          </xsd:annotation>
+        </xsd:element>
+        <xsd:element name="lastModifiedBy" minOccurs="0" maxOccurs="1" type="xsd:string"/>
+        <xsd:element ref="dcterms:modified" minOccurs="0" maxOccurs="1"/>
+        <xsd:element name="contentStatus" minOccurs="0" maxOccurs="1" type="xsd:string"/>
+      </xsd:all>
+    </xsd:complexType>
+  </xsd:schema>
+  <xs:schema xmlns:pc="http://schemas.microsoft.com/office/infopath/2007/PartnerControls" xmlns:xs="http://www.w3.org/2001/XMLSchema" targetNamespace="http://schemas.microsoft.com/office/infopath/2007/PartnerControls" elementFormDefault="qualified" attributeFormDefault="unqualified">
+    <xs:element name="Person">
+      <xs:complexType>
+        <xs:sequence>
+          <xs:element ref="pc:DisplayName" minOccurs="0"/>
+          <xs:element ref="pc:AccountId" minOccurs="0"/>
+          <xs:element ref="pc:AccountType" minOccurs="0"/>
+        </xs:sequence>
+      </xs:complexType>
+    </xs:element>
+    <xs:element name="DisplayName" type="xs:string"/>
+    <xs:element name="AccountId" type="xs:string"/>
+    <xs:element name="AccountType" type="xs:string"/>
+    <xs:element name="BDCAssociatedEntity">
+      <xs:complexType>
+        <xs:sequence>
+          <xs:element ref="pc:BDCEntity" minOccurs="0" maxOccurs="unbounded"/>
+        </xs:sequence>
+        <xs:attribute ref="pc:EntityNamespace"/>
+        <xs:attribute ref="pc:EntityName"/>
+        <xs:attribute ref="pc:SystemInstanceName"/>
+        <xs:attribute ref="pc:AssociationName"/>
+      </xs:complexType>
+    </xs:element>
+    <xs:attribute name="EntityNamespace" type="xs:string"/>
+    <xs:attribute name="EntityName" type="xs:string"/>
+    <xs:attribute name="SystemInstanceName" type="xs:string"/>
+    <xs:attribute name="AssociationName" type="xs:string"/>
+    <xs:element name="BDCEntity">
+      <xs:complexType>
+        <xs:sequence>
+          <xs:element ref="pc:EntityDisplayName" minOccurs="0"/>
+          <xs:element ref="pc:EntityInstanceReference" minOccurs="0"/>
+          <xs:element ref="pc:EntityId1" minOccurs="0"/>
+          <xs:element ref="pc:EntityId2" minOccurs="0"/>
+          <xs:element ref="pc:EntityId3" minOccurs="0"/>
+          <xs:element ref="pc:EntityId4" minOccurs="0"/>
+          <xs:element ref="pc:EntityId5" minOccurs="0"/>
+        </xs:sequence>
+      </xs:complexType>
+    </xs:element>
+    <xs:element name="EntityDisplayName" type="xs:string"/>
+    <xs:element name="EntityInstanceReference" type="xs:string"/>
+    <xs:element name="EntityId1" type="xs:string"/>
+    <xs:element name="EntityId2" type="xs:string"/>
+    <xs:element name="EntityId3" type="xs:string"/>
+    <xs:element name="EntityId4" type="xs:string"/>
+    <xs:element name="EntityId5" type="xs:string"/>
+    <xs:element name="Terms">
+      <xs:complexType>
+        <xs:sequence>
+          <xs:element ref="pc:TermInfo" minOccurs="0" maxOccurs="unbounded"/>
+        </xs:sequence>
+      </xs:complexType>
+    </xs:element>
+    <xs:element name="TermInfo">
+      <xs:complexType>
+        <xs:sequence>
+          <xs:element ref="pc:TermName" minOccurs="0"/>
+          <xs:element ref="pc:TermId" minOccurs="0"/>
+        </xs:sequence>
+      </xs:complexType>
+    </xs:element>
+    <xs:element name="TermName" type="xs:string"/>
+    <xs:element name="TermId" type="xs:string"/>
+  </xs:schema>
+</ct:contentTypeSchema>
+</file>
+
+<file path=customXml/item3.xml><?xml version="1.0" encoding="utf-8"?>
+<?mso-contentType ?>
+<FormTemplates xmlns="http://schemas.microsoft.com/sharepoint/v3/contenttype/forms">
+  <Display>DocumentLibraryForm</Display>
+  <Edit>DocumentLibraryForm</Edit>
+  <New>DocumentLibraryForm</New>
+</FormTemplates>
+</file>
+
+<file path=customXml/itemProps1.xml><?xml version="1.0" encoding="utf-8"?>
+<ds:datastoreItem xmlns:ds="http://schemas.openxmlformats.org/officeDocument/2006/customXml" ds:itemID="{F7288C9A-723C-45C4-B592-98A4A6A4C335}">
+  <ds:schemaRefs>
+    <ds:schemaRef ds:uri="http://schemas.microsoft.com/office/2006/metadata/properties"/>
+    <ds:schemaRef ds:uri="http://schemas.microsoft.com/office/infopath/2007/PartnerControls"/>
+    <ds:schemaRef ds:uri="26585f66-47fc-498d-b213-b46953568bdc"/>
+  </ds:schemaRefs>
+</ds:datastoreItem>
+</file>
+
+<file path=customXml/itemProps2.xml><?xml version="1.0" encoding="utf-8"?>
+<ds:datastoreItem xmlns:ds="http://schemas.openxmlformats.org/officeDocument/2006/customXml" ds:itemID="{BE701607-206E-42A2-BB8A-D51890C4D5B3}">
+  <ds:schemaRefs>
+    <ds:schemaRef ds:uri="http://schemas.microsoft.com/office/2006/metadata/contentType"/>
+    <ds:schemaRef ds:uri="http://schemas.microsoft.com/office/2006/metadata/properties/metaAttributes"/>
+    <ds:schemaRef ds:uri="http://www.w3.org/2001/XMLSchema"/>
+    <ds:schemaRef ds:uri="http://schemas.microsoft.com/office/2006/metadata/properties"/>
+    <ds:schemaRef ds:uri="26585f66-47fc-498d-b213-b46953568bdc"/>
+    <ds:schemaRef ds:uri="984dc5cf-9f96-4254-8c6c-2d4fc144aaf2"/>
+    <ds:schemaRef ds:uri="http://schemas.microsoft.com/office/2006/documentManagement/types"/>
+    <ds:schemaRef ds:uri="http://schemas.microsoft.com/office/infopath/2007/PartnerControls"/>
+    <ds:schemaRef ds:uri="http://schemas.openxmlformats.org/package/2006/metadata/core-properties"/>
+    <ds:schemaRef ds:uri="http://purl.org/dc/elements/1.1/"/>
+    <ds:schemaRef ds:uri="http://purl.org/dc/terms/"/>
+    <ds:schemaRef ds:uri="http://schemas.microsoft.com/internal/obd"/>
+  </ds:schemaRefs>
+</ds:datastoreItem>
+</file>
+
+<file path=customXml/itemProps3.xml><?xml version="1.0" encoding="utf-8"?>
+<ds:datastoreItem xmlns:ds="http://schemas.openxmlformats.org/officeDocument/2006/customXml" ds:itemID="{E3555314-E0B3-4427-A9D0-1122AB87DEBF}">
+  <ds:schemaRefs>
+    <ds:schemaRef ds:uri="http://schemas.microsoft.com/sharepoint/v3/contenttype/forms"/>
+  </ds:schemaRefs>
+</ds:datastoreItem>
 </file>
</xml_diff>